<commit_message>
Complete Banking System project
</commit_message>
<xml_diff>
--- a/Banking_System_Project_Documentation.docx
+++ b/Banking_System_Project_Documentation.docx
@@ -4,136 +4,308 @@
   <w:body>
     <w:p>
       <w:pPr>
+        <w:spacing w:before="0" w:after="40"/>
         <w:jc w:val="center"/>
       </w:pPr>
       <w:r>
         <w:rPr>
+          <w:rFonts w:ascii="Calibri" w:hAnsi="Calibri"/>
           <w:b/>
-          <w:sz w:val="40"/>
+          <w:color w:val="003366"/>
+          <w:sz w:val="48"/>
         </w:rPr>
         <w:t>CONSOLE-BASED BANKING SYSTEM</w:t>
       </w:r>
     </w:p>
     <w:p>
       <w:pPr>
+        <w:spacing w:after="480"/>
         <w:jc w:val="center"/>
       </w:pPr>
       <w:r>
         <w:rPr>
-          <w:b/>
-          <w:sz w:val="26"/>
+          <w:i/>
+          <w:color w:val="646464"/>
+          <w:sz w:val="28"/>
         </w:rPr>
-        <w:t>Object-Oriented Programming Project Documentation</w:t>
+        <w:t>Project Documentation &amp; Specification</w:t>
       </w:r>
     </w:p>
-    <w:p/>
     <w:p>
       <w:pPr>
         <w:pStyle w:val="Heading1"/>
+        <w:keepNext/>
+        <w:spacing w:before="240" w:after="120"/>
       </w:pPr>
       <w:r>
+        <w:rPr>
+          <w:rFonts w:ascii="Calibri" w:hAnsi="Calibri"/>
+          <w:b/>
+          <w:color w:val="003366"/>
+          <w:sz w:val="32"/>
+        </w:rPr>
         <w:t>1. Introduction</w:t>
       </w:r>
     </w:p>
     <w:p>
+      <w:pPr>
+        <w:spacing w:after="120"/>
+      </w:pPr>
       <w:r>
-        <w:t>The Console-Based Banking System is a Java application developed using Object-Oriented Programming (OOP) concepts. The application allows a user to create either a Savings Account or a Current Account and perform basic banking operations through a console menu.</w:t>
+        <w:t>The Console-Based Banking System is a Java application developed using Object-Oriented Programming (OOP) concepts. The application allows users to create Savings Accounts and Current Accounts and perform banking operations through an interactive console menu.</w:t>
       </w:r>
     </w:p>
     <w:p>
       <w:pPr>
+        <w:spacing w:after="240"/>
+      </w:pPr>
+      <w:r>
+        <w:t>SQLite is integrated into the project to store account information and update account balances permanently via JDBC connectivity.</w:t>
+      </w:r>
+    </w:p>
+    <w:p>
+      <w:pPr>
         <w:pStyle w:val="Heading1"/>
+        <w:keepNext/>
+        <w:spacing w:before="240" w:after="120"/>
       </w:pPr>
       <w:r>
+        <w:rPr>
+          <w:rFonts w:ascii="Calibri" w:hAnsi="Calibri"/>
+          <w:b/>
+          <w:color w:val="003366"/>
+          <w:sz w:val="32"/>
+        </w:rPr>
         <w:t>2. Objectives</w:t>
       </w:r>
     </w:p>
     <w:p>
       <w:pPr>
         <w:pStyle w:val="ListBullet"/>
+        <w:spacing w:before="0" w:after="60"/>
       </w:pPr>
       <w:r>
-        <w:t>To develop a simple console-based banking application using Java.</w:t>
+        <w:rPr>
+          <w:rFonts w:ascii="Calibri" w:hAnsi="Calibri"/>
+        </w:rPr>
+        <w:t>Develop a simple console-based banking application using Java.</w:t>
       </w:r>
     </w:p>
     <w:p>
       <w:pPr>
         <w:pStyle w:val="ListBullet"/>
+        <w:spacing w:before="0" w:after="60"/>
       </w:pPr>
       <w:r>
-        <w:t>To apply core Object-Oriented Programming concepts in a practical project.</w:t>
+        <w:rPr>
+          <w:rFonts w:ascii="Calibri" w:hAnsi="Calibri"/>
+        </w:rPr>
+        <w:t>Apply Object-Oriented Programming concepts.</w:t>
       </w:r>
     </w:p>
     <w:p>
       <w:pPr>
         <w:pStyle w:val="ListBullet"/>
+        <w:spacing w:before="0" w:after="60"/>
       </w:pPr>
       <w:r>
-        <w:t>To support Savings Account and Current Account types.</w:t>
+        <w:rPr>
+          <w:rFonts w:ascii="Calibri" w:hAnsi="Calibri"/>
+        </w:rPr>
+        <w:t>Implement Savings Account and Current Account types.</w:t>
       </w:r>
     </w:p>
     <w:p>
       <w:pPr>
         <w:pStyle w:val="ListBullet"/>
+        <w:spacing w:before="0" w:after="60"/>
       </w:pPr>
       <w:r>
-        <w:t>To perform deposit, withdrawal, interest, account display, and loan operations.</w:t>
+        <w:rPr>
+          <w:rFonts w:ascii="Calibri" w:hAnsi="Calibri"/>
+        </w:rPr>
+        <w:t>Perform deposit and withdrawal operations.</w:t>
       </w:r>
     </w:p>
     <w:p>
       <w:pPr>
         <w:pStyle w:val="ListBullet"/>
+        <w:spacing w:before="0" w:after="60"/>
       </w:pPr>
       <w:r>
-        <w:t>To demonstrate exception handling for invalid banking transactions.</w:t>
+        <w:rPr>
+          <w:rFonts w:ascii="Calibri" w:hAnsi="Calibri"/>
+        </w:rPr>
+        <w:t>Calculate account interest.</w:t>
       </w:r>
     </w:p>
     <w:p>
       <w:pPr>
+        <w:pStyle w:val="ListBullet"/>
+        <w:spacing w:before="0" w:after="60"/>
+      </w:pPr>
+      <w:r>
+        <w:rPr>
+          <w:rFonts w:ascii="Calibri" w:hAnsi="Calibri"/>
+        </w:rPr>
+        <w:t>Implement loan processing.</w:t>
+      </w:r>
+    </w:p>
+    <w:p>
+      <w:pPr>
+        <w:pStyle w:val="ListBullet"/>
+        <w:spacing w:before="0" w:after="60"/>
+      </w:pPr>
+      <w:r>
+        <w:rPr>
+          <w:rFonts w:ascii="Calibri" w:hAnsi="Calibri"/>
+        </w:rPr>
+        <w:t>Handle banking errors using a custom exception.</w:t>
+      </w:r>
+    </w:p>
+    <w:p>
+      <w:pPr>
+        <w:pStyle w:val="ListBullet"/>
+        <w:spacing w:before="0" w:after="60"/>
+      </w:pPr>
+      <w:r>
+        <w:rPr>
+          <w:rFonts w:ascii="Calibri" w:hAnsi="Calibri"/>
+        </w:rPr>
+        <w:t>Connect Java with an SQLite database.</w:t>
+      </w:r>
+    </w:p>
+    <w:p>
+      <w:pPr>
+        <w:pStyle w:val="ListBullet"/>
+        <w:spacing w:before="0" w:after="60"/>
+      </w:pPr>
+      <w:r>
+        <w:rPr>
+          <w:rFonts w:ascii="Calibri" w:hAnsi="Calibri"/>
+        </w:rPr>
+        <w:t>Store account information permanently in the database.</w:t>
+      </w:r>
+    </w:p>
+    <w:p>
+      <w:pPr>
+        <w:pStyle w:val="ListBullet"/>
+        <w:spacing w:before="0" w:after="60"/>
+      </w:pPr>
+      <w:r>
+        <w:rPr>
+          <w:rFonts w:ascii="Calibri" w:hAnsi="Calibri"/>
+        </w:rPr>
+        <w:t>Run and test the project using Eclipse IDE.</w:t>
+      </w:r>
+    </w:p>
+    <w:p>
+      <w:pPr>
         <w:pStyle w:val="Heading1"/>
+        <w:keepNext/>
+        <w:spacing w:before="240" w:after="120"/>
       </w:pPr>
       <w:r>
+        <w:rPr>
+          <w:rFonts w:ascii="Calibri" w:hAnsi="Calibri"/>
+          <w:b/>
+          <w:color w:val="003366"/>
+          <w:sz w:val="32"/>
+        </w:rPr>
         <w:t>3. OOP Concepts Used</w:t>
       </w:r>
     </w:p>
     <w:tbl>
       <w:tblPr>
-        <w:tblStyle w:val="TableGrid"/>
         <w:tblW w:type="auto" w:w="0"/>
+        <w:jc w:val="center"/>
         <w:tblLook w:firstColumn="1" w:firstRow="1" w:lastColumn="0" w:lastRow="0" w:noHBand="0" w:noVBand="1" w:val="04A0"/>
+        <w:tblBorders>
+          <w:top w:val="single" w:sz="4" w:space="0" w:color="CCCCCC"/>
+          <w:bottom w:val="single" w:sz="4" w:space="0" w:color="CCCCCC"/>
+          <w:left w:val="none"/>
+          <w:right w:val="none"/>
+          <w:insideH w:val="single" w:sz="4" w:space="0" w:color="CCCCCC"/>
+          <w:insideV w:val="none"/>
+        </w:tblBorders>
       </w:tblPr>
       <w:tblGrid>
-        <w:gridCol w:w="2880"/>
-        <w:gridCol w:w="2880"/>
-        <w:gridCol w:w="2880"/>
+        <w:gridCol w:w="2592"/>
+        <w:gridCol w:w="3168"/>
+        <w:gridCol w:w="3600"/>
       </w:tblGrid>
       <w:tr>
         <w:tc>
           <w:tcPr>
-            <w:tcW w:type="dxa" w:w="2880"/>
+            <w:tcW w:type="dxa" w:w="3120"/>
+            <w:vAlign w:val="center"/>
+            <w:tcMar>
+              <w:top w:w="120" w:type="dxa"/>
+              <w:bottom w:w="120" w:type="dxa"/>
+              <w:left w:w="150" w:type="dxa"/>
+              <w:right w:w="150" w:type="dxa"/>
+            </w:tcMar>
+            <w:shd w:fill="003366"/>
           </w:tcPr>
           <w:p>
+            <w:pPr>
+              <w:spacing w:before="0" w:after="0"/>
+            </w:pPr>
             <w:r>
+              <w:rPr>
+                <w:b/>
+                <w:color w:val="FFFFFF"/>
+              </w:rPr>
               <w:t>Concept</w:t>
             </w:r>
           </w:p>
         </w:tc>
         <w:tc>
           <w:tcPr>
-            <w:tcW w:type="dxa" w:w="2880"/>
+            <w:tcW w:type="dxa" w:w="3120"/>
+            <w:vAlign w:val="center"/>
+            <w:tcMar>
+              <w:top w:w="120" w:type="dxa"/>
+              <w:bottom w:w="120" w:type="dxa"/>
+              <w:left w:w="150" w:type="dxa"/>
+              <w:right w:w="150" w:type="dxa"/>
+            </w:tcMar>
+            <w:shd w:fill="003366"/>
           </w:tcPr>
           <w:p>
+            <w:pPr>
+              <w:spacing w:before="0" w:after="0"/>
+            </w:pPr>
             <w:r>
+              <w:rPr>
+                <w:b/>
+                <w:color w:val="FFFFFF"/>
+              </w:rPr>
               <w:t>Used In</w:t>
             </w:r>
           </w:p>
         </w:tc>
         <w:tc>
           <w:tcPr>
-            <w:tcW w:type="dxa" w:w="2880"/>
+            <w:tcW w:type="dxa" w:w="3120"/>
+            <w:vAlign w:val="center"/>
+            <w:tcMar>
+              <w:top w:w="120" w:type="dxa"/>
+              <w:bottom w:w="120" w:type="dxa"/>
+              <w:left w:w="150" w:type="dxa"/>
+              <w:right w:w="150" w:type="dxa"/>
+            </w:tcMar>
+            <w:shd w:fill="003366"/>
           </w:tcPr>
           <w:p>
+            <w:pPr>
+              <w:spacing w:before="0" w:after="0"/>
+            </w:pPr>
             <w:r>
+              <w:rPr>
+                <w:b/>
+                <w:color w:val="FFFFFF"/>
+              </w:rPr>
               <w:t>Purpose</w:t>
             </w:r>
           </w:p>
@@ -142,19 +314,44 @@
       <w:tr>
         <w:tc>
           <w:tcPr>
-            <w:tcW w:type="dxa" w:w="2880"/>
+            <w:tcW w:type="dxa" w:w="3120"/>
+            <w:vAlign w:val="center"/>
+            <w:tcMar>
+              <w:top w:w="120" w:type="dxa"/>
+              <w:bottom w:w="120" w:type="dxa"/>
+              <w:left w:w="150" w:type="dxa"/>
+              <w:right w:w="150" w:type="dxa"/>
+            </w:tcMar>
+            <w:shd w:fill="F5F7FA"/>
           </w:tcPr>
           <w:p>
+            <w:pPr>
+              <w:spacing w:before="0" w:after="0"/>
+            </w:pPr>
             <w:r>
+              <w:rPr>
+                <w:b/>
+              </w:rPr>
               <w:t>Encapsulation</w:t>
             </w:r>
           </w:p>
         </w:tc>
         <w:tc>
           <w:tcPr>
-            <w:tcW w:type="dxa" w:w="2880"/>
+            <w:tcW w:type="dxa" w:w="3120"/>
+            <w:vAlign w:val="center"/>
+            <w:tcMar>
+              <w:top w:w="120" w:type="dxa"/>
+              <w:bottom w:w="120" w:type="dxa"/>
+              <w:left w:w="150" w:type="dxa"/>
+              <w:right w:w="150" w:type="dxa"/>
+            </w:tcMar>
+            <w:shd w:fill="F5F7FA"/>
           </w:tcPr>
           <w:p>
+            <w:pPr>
+              <w:spacing w:before="0" w:after="0"/>
+            </w:pPr>
             <w:r>
               <w:t>Account</w:t>
             </w:r>
@@ -162,11 +359,22 @@
         </w:tc>
         <w:tc>
           <w:tcPr>
-            <w:tcW w:type="dxa" w:w="2880"/>
+            <w:tcW w:type="dxa" w:w="3120"/>
+            <w:vAlign w:val="center"/>
+            <w:tcMar>
+              <w:top w:w="120" w:type="dxa"/>
+              <w:bottom w:w="120" w:type="dxa"/>
+              <w:left w:w="150" w:type="dxa"/>
+              <w:right w:w="150" w:type="dxa"/>
+            </w:tcMar>
+            <w:shd w:fill="F5F7FA"/>
           </w:tcPr>
           <w:p>
+            <w:pPr>
+              <w:spacing w:before="0" w:after="0"/>
+            </w:pPr>
             <w:r>
-              <w:t>Private account data is accessed through methods.</w:t>
+              <w:t>Keeps account data private and provides methods to access it.</w:t>
             </w:r>
           </w:p>
         </w:tc>
@@ -174,19 +382,44 @@
       <w:tr>
         <w:tc>
           <w:tcPr>
-            <w:tcW w:type="dxa" w:w="2880"/>
+            <w:tcW w:type="dxa" w:w="3120"/>
+            <w:vAlign w:val="center"/>
+            <w:tcMar>
+              <w:top w:w="120" w:type="dxa"/>
+              <w:bottom w:w="120" w:type="dxa"/>
+              <w:left w:w="150" w:type="dxa"/>
+              <w:right w:w="150" w:type="dxa"/>
+            </w:tcMar>
+            <w:shd w:fill="FFFFFF"/>
           </w:tcPr>
           <w:p>
+            <w:pPr>
+              <w:spacing w:before="0" w:after="0"/>
+            </w:pPr>
             <w:r>
+              <w:rPr>
+                <w:b/>
+              </w:rPr>
               <w:t>Abstraction</w:t>
             </w:r>
           </w:p>
         </w:tc>
         <w:tc>
           <w:tcPr>
-            <w:tcW w:type="dxa" w:w="2880"/>
+            <w:tcW w:type="dxa" w:w="3120"/>
+            <w:vAlign w:val="center"/>
+            <w:tcMar>
+              <w:top w:w="120" w:type="dxa"/>
+              <w:bottom w:w="120" w:type="dxa"/>
+              <w:left w:w="150" w:type="dxa"/>
+              <w:right w:w="150" w:type="dxa"/>
+            </w:tcMar>
+            <w:shd w:fill="FFFFFF"/>
           </w:tcPr>
           <w:p>
+            <w:pPr>
+              <w:spacing w:before="0" w:after="0"/>
+            </w:pPr>
             <w:r>
               <w:t>Account</w:t>
             </w:r>
@@ -194,11 +427,22 @@
         </w:tc>
         <w:tc>
           <w:tcPr>
-            <w:tcW w:type="dxa" w:w="2880"/>
+            <w:tcW w:type="dxa" w:w="3120"/>
+            <w:vAlign w:val="center"/>
+            <w:tcMar>
+              <w:top w:w="120" w:type="dxa"/>
+              <w:bottom w:w="120" w:type="dxa"/>
+              <w:left w:w="150" w:type="dxa"/>
+              <w:right w:w="150" w:type="dxa"/>
+            </w:tcMar>
+            <w:shd w:fill="FFFFFF"/>
           </w:tcPr>
           <w:p>
+            <w:pPr>
+              <w:spacing w:before="0" w:after="0"/>
+            </w:pPr>
             <w:r>
-              <w:t>Common account behavior is defined in an abstract class.</w:t>
+              <w:t>Defines common account behavior using an abstract class.</w:t>
             </w:r>
           </w:p>
         </w:tc>
@@ -206,19 +450,44 @@
       <w:tr>
         <w:tc>
           <w:tcPr>
-            <w:tcW w:type="dxa" w:w="2880"/>
+            <w:tcW w:type="dxa" w:w="3120"/>
+            <w:vAlign w:val="center"/>
+            <w:tcMar>
+              <w:top w:w="120" w:type="dxa"/>
+              <w:bottom w:w="120" w:type="dxa"/>
+              <w:left w:w="150" w:type="dxa"/>
+              <w:right w:w="150" w:type="dxa"/>
+            </w:tcMar>
+            <w:shd w:fill="F5F7FA"/>
           </w:tcPr>
           <w:p>
+            <w:pPr>
+              <w:spacing w:before="0" w:after="0"/>
+            </w:pPr>
             <w:r>
+              <w:rPr>
+                <w:b/>
+              </w:rPr>
               <w:t>Inheritance</w:t>
             </w:r>
           </w:p>
         </w:tc>
         <w:tc>
           <w:tcPr>
-            <w:tcW w:type="dxa" w:w="2880"/>
+            <w:tcW w:type="dxa" w:w="3120"/>
+            <w:vAlign w:val="center"/>
+            <w:tcMar>
+              <w:top w:w="120" w:type="dxa"/>
+              <w:bottom w:w="120" w:type="dxa"/>
+              <w:left w:w="150" w:type="dxa"/>
+              <w:right w:w="150" w:type="dxa"/>
+            </w:tcMar>
+            <w:shd w:fill="F5F7FA"/>
           </w:tcPr>
           <w:p>
+            <w:pPr>
+              <w:spacing w:before="0" w:after="0"/>
+            </w:pPr>
             <w:r>
               <w:t>SavingsAccount, CurrentAccount</w:t>
             </w:r>
@@ -226,11 +495,22 @@
         </w:tc>
         <w:tc>
           <w:tcPr>
-            <w:tcW w:type="dxa" w:w="2880"/>
+            <w:tcW w:type="dxa" w:w="3120"/>
+            <w:vAlign w:val="center"/>
+            <w:tcMar>
+              <w:top w:w="120" w:type="dxa"/>
+              <w:bottom w:w="120" w:type="dxa"/>
+              <w:left w:w="150" w:type="dxa"/>
+              <w:right w:w="150" w:type="dxa"/>
+            </w:tcMar>
+            <w:shd w:fill="F5F7FA"/>
           </w:tcPr>
           <w:p>
+            <w:pPr>
+              <w:spacing w:before="0" w:after="0"/>
+            </w:pPr>
             <w:r>
-              <w:t>Both account types extend Account.</w:t>
+              <w:t>Both account types inherit from Account.</w:t>
             </w:r>
           </w:p>
         </w:tc>
@@ -238,31 +518,67 @@
       <w:tr>
         <w:tc>
           <w:tcPr>
-            <w:tcW w:type="dxa" w:w="2880"/>
+            <w:tcW w:type="dxa" w:w="3120"/>
+            <w:vAlign w:val="center"/>
+            <w:tcMar>
+              <w:top w:w="120" w:type="dxa"/>
+              <w:bottom w:w="120" w:type="dxa"/>
+              <w:left w:w="150" w:type="dxa"/>
+              <w:right w:w="150" w:type="dxa"/>
+            </w:tcMar>
+            <w:shd w:fill="FFFFFF"/>
           </w:tcPr>
           <w:p>
+            <w:pPr>
+              <w:spacing w:before="0" w:after="0"/>
+            </w:pPr>
             <w:r>
+              <w:rPr>
+                <w:b/>
+              </w:rPr>
               <w:t>Interface</w:t>
             </w:r>
           </w:p>
         </w:tc>
         <w:tc>
           <w:tcPr>
-            <w:tcW w:type="dxa" w:w="2880"/>
+            <w:tcW w:type="dxa" w:w="3120"/>
+            <w:vAlign w:val="center"/>
+            <w:tcMar>
+              <w:top w:w="120" w:type="dxa"/>
+              <w:bottom w:w="120" w:type="dxa"/>
+              <w:left w:w="150" w:type="dxa"/>
+              <w:right w:w="150" w:type="dxa"/>
+            </w:tcMar>
+            <w:shd w:fill="FFFFFF"/>
           </w:tcPr>
           <w:p>
+            <w:pPr>
+              <w:spacing w:before="0" w:after="0"/>
+            </w:pPr>
             <w:r>
-              <w:t>TransactionService</w:t>
+              <w:t>TransactionService, LoanProcessing</w:t>
             </w:r>
           </w:p>
         </w:tc>
         <w:tc>
           <w:tcPr>
-            <w:tcW w:type="dxa" w:w="2880"/>
+            <w:tcW w:type="dxa" w:w="3120"/>
+            <w:vAlign w:val="center"/>
+            <w:tcMar>
+              <w:top w:w="120" w:type="dxa"/>
+              <w:bottom w:w="120" w:type="dxa"/>
+              <w:left w:w="150" w:type="dxa"/>
+              <w:right w:w="150" w:type="dxa"/>
+            </w:tcMar>
+            <w:shd w:fill="FFFFFF"/>
           </w:tcPr>
           <w:p>
+            <w:pPr>
+              <w:spacing w:before="0" w:after="0"/>
+            </w:pPr>
             <w:r>
-              <w:t>Defines deposit and withdrawal operations.</w:t>
+              <w:t>Defines transaction and loan operations.</w:t>
             </w:r>
           </w:p>
         </w:tc>
@@ -270,31 +586,67 @@
       <w:tr>
         <w:tc>
           <w:tcPr>
-            <w:tcW w:type="dxa" w:w="2880"/>
+            <w:tcW w:type="dxa" w:w="3120"/>
+            <w:vAlign w:val="center"/>
+            <w:tcMar>
+              <w:top w:w="120" w:type="dxa"/>
+              <w:bottom w:w="120" w:type="dxa"/>
+              <w:left w:w="150" w:type="dxa"/>
+              <w:right w:w="150" w:type="dxa"/>
+            </w:tcMar>
+            <w:shd w:fill="F5F7FA"/>
           </w:tcPr>
           <w:p>
+            <w:pPr>
+              <w:spacing w:before="0" w:after="0"/>
+            </w:pPr>
             <w:r>
-              <w:t>Interface</w:t>
+              <w:rPr>
+                <w:b/>
+              </w:rPr>
+              <w:t>Polymorphism</w:t>
             </w:r>
           </w:p>
         </w:tc>
         <w:tc>
           <w:tcPr>
-            <w:tcW w:type="dxa" w:w="2880"/>
+            <w:tcW w:type="dxa" w:w="3120"/>
+            <w:vAlign w:val="center"/>
+            <w:tcMar>
+              <w:top w:w="120" w:type="dxa"/>
+              <w:bottom w:w="120" w:type="dxa"/>
+              <w:left w:w="150" w:type="dxa"/>
+              <w:right w:w="150" w:type="dxa"/>
+            </w:tcMar>
+            <w:shd w:fill="F5F7FA"/>
           </w:tcPr>
           <w:p>
+            <w:pPr>
+              <w:spacing w:before="0" w:after="0"/>
+            </w:pPr>
             <w:r>
-              <w:t>LoanProcessing</w:t>
+              <w:t>MainApp</w:t>
             </w:r>
           </w:p>
         </w:tc>
         <w:tc>
           <w:tcPr>
-            <w:tcW w:type="dxa" w:w="2880"/>
+            <w:tcW w:type="dxa" w:w="3120"/>
+            <w:vAlign w:val="center"/>
+            <w:tcMar>
+              <w:top w:w="120" w:type="dxa"/>
+              <w:bottom w:w="120" w:type="dxa"/>
+              <w:left w:w="150" w:type="dxa"/>
+              <w:right w:w="150" w:type="dxa"/>
+            </w:tcMar>
+            <w:shd w:fill="F5F7FA"/>
           </w:tcPr>
           <w:p>
+            <w:pPr>
+              <w:spacing w:before="0" w:after="0"/>
+            </w:pPr>
             <w:r>
-              <w:t>Defines loan processing operation.</w:t>
+              <w:t>An Account reference can refer to different account types.</w:t>
             </w:r>
           </w:p>
         </w:tc>
@@ -302,51 +654,44 @@
       <w:tr>
         <w:tc>
           <w:tcPr>
-            <w:tcW w:type="dxa" w:w="2880"/>
+            <w:tcW w:type="dxa" w:w="3120"/>
+            <w:vAlign w:val="center"/>
+            <w:tcMar>
+              <w:top w:w="120" w:type="dxa"/>
+              <w:bottom w:w="120" w:type="dxa"/>
+              <w:left w:w="150" w:type="dxa"/>
+              <w:right w:w="150" w:type="dxa"/>
+            </w:tcMar>
+            <w:shd w:fill="FFFFFF"/>
           </w:tcPr>
           <w:p>
+            <w:pPr>
+              <w:spacing w:before="0" w:after="0"/>
+            </w:pPr>
             <w:r>
-              <w:t>Polymorphism</w:t>
-            </w:r>
-          </w:p>
-        </w:tc>
-        <w:tc>
-          <w:tcPr>
-            <w:tcW w:type="dxa" w:w="2880"/>
-          </w:tcPr>
-          <w:p>
-            <w:r>
-              <w:t>MainApp</w:t>
-            </w:r>
-          </w:p>
-        </w:tc>
-        <w:tc>
-          <w:tcPr>
-            <w:tcW w:type="dxa" w:w="2880"/>
-          </w:tcPr>
-          <w:p>
-            <w:r>
-              <w:t>Account reference can refer to SavingsAccount or CurrentAccount.</w:t>
-            </w:r>
-          </w:p>
-        </w:tc>
-      </w:tr>
-      <w:tr>
-        <w:tc>
-          <w:tcPr>
-            <w:tcW w:type="dxa" w:w="2880"/>
-          </w:tcPr>
-          <w:p>
-            <w:r>
+              <w:rPr>
+                <w:b/>
+              </w:rPr>
               <w:t>Method Overriding</w:t>
             </w:r>
           </w:p>
         </w:tc>
         <w:tc>
           <w:tcPr>
-            <w:tcW w:type="dxa" w:w="2880"/>
+            <w:tcW w:type="dxa" w:w="3120"/>
+            <w:vAlign w:val="center"/>
+            <w:tcMar>
+              <w:top w:w="120" w:type="dxa"/>
+              <w:bottom w:w="120" w:type="dxa"/>
+              <w:left w:w="150" w:type="dxa"/>
+              <w:right w:w="150" w:type="dxa"/>
+            </w:tcMar>
+            <w:shd w:fill="FFFFFF"/>
           </w:tcPr>
           <w:p>
+            <w:pPr>
+              <w:spacing w:before="0" w:after="0"/>
+            </w:pPr>
             <w:r>
               <w:t>SavingsAccount, CurrentAccount</w:t>
             </w:r>
@@ -354,9 +699,20 @@
         </w:tc>
         <w:tc>
           <w:tcPr>
-            <w:tcW w:type="dxa" w:w="2880"/>
+            <w:tcW w:type="dxa" w:w="3120"/>
+            <w:vAlign w:val="center"/>
+            <w:tcMar>
+              <w:top w:w="120" w:type="dxa"/>
+              <w:bottom w:w="120" w:type="dxa"/>
+              <w:left w:w="150" w:type="dxa"/>
+              <w:right w:w="150" w:type="dxa"/>
+            </w:tcMar>
+            <w:shd w:fill="FFFFFF"/>
           </w:tcPr>
           <w:p>
+            <w:pPr>
+              <w:spacing w:before="0" w:after="0"/>
+            </w:pPr>
             <w:r>
               <w:t>Child classes provide their own implementations.</w:t>
             </w:r>
@@ -366,19 +722,44 @@
       <w:tr>
         <w:tc>
           <w:tcPr>
-            <w:tcW w:type="dxa" w:w="2880"/>
+            <w:tcW w:type="dxa" w:w="3120"/>
+            <w:vAlign w:val="center"/>
+            <w:tcMar>
+              <w:top w:w="120" w:type="dxa"/>
+              <w:bottom w:w="120" w:type="dxa"/>
+              <w:left w:w="150" w:type="dxa"/>
+              <w:right w:w="150" w:type="dxa"/>
+            </w:tcMar>
+            <w:shd w:fill="F5F7FA"/>
           </w:tcPr>
           <w:p>
+            <w:pPr>
+              <w:spacing w:before="0" w:after="0"/>
+            </w:pPr>
             <w:r>
+              <w:rPr>
+                <w:b/>
+              </w:rPr>
               <w:t>Exception Handling</w:t>
             </w:r>
           </w:p>
         </w:tc>
         <w:tc>
           <w:tcPr>
-            <w:tcW w:type="dxa" w:w="2880"/>
+            <w:tcW w:type="dxa" w:w="3120"/>
+            <w:vAlign w:val="center"/>
+            <w:tcMar>
+              <w:top w:w="120" w:type="dxa"/>
+              <w:bottom w:w="120" w:type="dxa"/>
+              <w:left w:w="150" w:type="dxa"/>
+              <w:right w:w="150" w:type="dxa"/>
+            </w:tcMar>
+            <w:shd w:fill="F5F7FA"/>
           </w:tcPr>
           <w:p>
+            <w:pPr>
+              <w:spacing w:before="0" w:after="0"/>
+            </w:pPr>
             <w:r>
               <w:t>MainApp</w:t>
             </w:r>
@@ -386,11 +767,22 @@
         </w:tc>
         <w:tc>
           <w:tcPr>
-            <w:tcW w:type="dxa" w:w="2880"/>
+            <w:tcW w:type="dxa" w:w="3120"/>
+            <w:vAlign w:val="center"/>
+            <w:tcMar>
+              <w:top w:w="120" w:type="dxa"/>
+              <w:bottom w:w="120" w:type="dxa"/>
+              <w:left w:w="150" w:type="dxa"/>
+              <w:right w:w="150" w:type="dxa"/>
+            </w:tcMar>
+            <w:shd w:fill="F5F7FA"/>
           </w:tcPr>
           <w:p>
+            <w:pPr>
+              <w:spacing w:before="0" w:after="0"/>
+            </w:pPr>
             <w:r>
-              <w:t>Handles banking errors using try-catch.</w:t>
+              <w:t>Handles errors using try-catch.</w:t>
             </w:r>
           </w:p>
         </w:tc>
@@ -398,19 +790,44 @@
       <w:tr>
         <w:tc>
           <w:tcPr>
-            <w:tcW w:type="dxa" w:w="2880"/>
+            <w:tcW w:type="dxa" w:w="3120"/>
+            <w:vAlign w:val="center"/>
+            <w:tcMar>
+              <w:top w:w="120" w:type="dxa"/>
+              <w:bottom w:w="120" w:type="dxa"/>
+              <w:left w:w="150" w:type="dxa"/>
+              <w:right w:w="150" w:type="dxa"/>
+            </w:tcMar>
+            <w:shd w:fill="FFFFFF"/>
           </w:tcPr>
           <w:p>
+            <w:pPr>
+              <w:spacing w:before="0" w:after="0"/>
+            </w:pPr>
             <w:r>
+              <w:rPr>
+                <w:b/>
+              </w:rPr>
               <w:t>Custom Exception</w:t>
             </w:r>
           </w:p>
         </w:tc>
         <w:tc>
           <w:tcPr>
-            <w:tcW w:type="dxa" w:w="2880"/>
+            <w:tcW w:type="dxa" w:w="3120"/>
+            <w:vAlign w:val="center"/>
+            <w:tcMar>
+              <w:top w:w="120" w:type="dxa"/>
+              <w:bottom w:w="120" w:type="dxa"/>
+              <w:left w:w="150" w:type="dxa"/>
+              <w:right w:w="150" w:type="dxa"/>
+            </w:tcMar>
+            <w:shd w:fill="FFFFFF"/>
           </w:tcPr>
           <w:p>
+            <w:pPr>
+              <w:spacing w:before="0" w:after="0"/>
+            </w:pPr>
             <w:r>
               <w:t>BankingException</w:t>
             </w:r>
@@ -418,11 +835,817 @@
         </w:tc>
         <w:tc>
           <w:tcPr>
-            <w:tcW w:type="dxa" w:w="2880"/>
+            <w:tcW w:type="dxa" w:w="3120"/>
+            <w:vAlign w:val="center"/>
+            <w:tcMar>
+              <w:top w:w="120" w:type="dxa"/>
+              <w:bottom w:w="120" w:type="dxa"/>
+              <w:left w:w="150" w:type="dxa"/>
+              <w:right w:w="150" w:type="dxa"/>
+            </w:tcMar>
+            <w:shd w:fill="FFFFFF"/>
           </w:tcPr>
           <w:p>
+            <w:pPr>
+              <w:spacing w:before="0" w:after="0"/>
+            </w:pPr>
             <w:r>
-              <w:t>Represents banking-specific transaction errors.</w:t>
+              <w:t>Handles banking-specific errors.</w:t>
+            </w:r>
+          </w:p>
+        </w:tc>
+      </w:tr>
+    </w:tbl>
+    <w:p>
+      <w:pPr>
+        <w:spacing w:after="240"/>
+      </w:pPr>
+    </w:p>
+    <w:p>
+      <w:pPr>
+        <w:pStyle w:val="Heading1"/>
+        <w:keepNext/>
+        <w:spacing w:before="240" w:after="120"/>
+      </w:pPr>
+      <w:r>
+        <w:rPr>
+          <w:rFonts w:ascii="Calibri" w:hAnsi="Calibri"/>
+          <w:b/>
+          <w:color w:val="003366"/>
+          <w:sz w:val="32"/>
+        </w:rPr>
+        <w:t>4. Project Structure</w:t>
+      </w:r>
+    </w:p>
+    <w:p>
+      <w:pPr>
+        <w:spacing w:before="120" w:after="240"/>
+        <w:ind w:left="288"/>
+      </w:pPr>
+      <w:r>
+        <w:rPr>
+          <w:rFonts w:ascii="Consolas" w:hAnsi="Consolas"/>
+          <w:sz w:val="19"/>
+        </w:rPr>
+        <w:t>BankingSystem_Eclipse_Project</w:t>
+        <w:br/>
+        <w:t>│</w:t>
+        <w:br/>
+        <w:t>├── src</w:t>
+        <w:br/>
+        <w:t>│   ├── Account.java</w:t>
+        <w:br/>
+        <w:t>│   ├── Bank.java</w:t>
+        <w:br/>
+        <w:t>│   ├── BankingException.java</w:t>
+        <w:br/>
+        <w:t>│   ├── CurrentAccount.java</w:t>
+        <w:br/>
+        <w:t>│   ├── DatabaseConnection.java</w:t>
+        <w:br/>
+        <w:t>│   ├── DatabaseSetup.java</w:t>
+        <w:br/>
+        <w:t>│   ├── DatabaseTest.java</w:t>
+        <w:br/>
+        <w:t>│   ├── AccountDAO.java</w:t>
+        <w:br/>
+        <w:t>│   ├── AccountViewer.java</w:t>
+        <w:br/>
+        <w:t>│   ├── LoanProcessing.java</w:t>
+        <w:br/>
+        <w:t>│   ├── MainApp.java</w:t>
+        <w:br/>
+        <w:t>│   ├── SavingsAccount.java</w:t>
+        <w:br/>
+        <w:t>│   └── TransactionService.java</w:t>
+        <w:br/>
+        <w:t>│</w:t>
+        <w:br/>
+        <w:t>├── lib</w:t>
+        <w:br/>
+        <w:t>│   └── sqlite-jdbc-3.53.2.1.jar</w:t>
+        <w:br/>
+        <w:t>│</w:t>
+        <w:br/>
+        <w:t>├── banking.db</w:t>
+        <w:br/>
+        <w:t>│</w:t>
+        <w:br/>
+        <w:t>└── Banking_System_Project_Documentation.docx</w:t>
+      </w:r>
+    </w:p>
+    <w:p>
+      <w:pPr>
+        <w:pStyle w:val="Heading1"/>
+        <w:keepNext/>
+        <w:spacing w:before="240" w:after="120"/>
+      </w:pPr>
+      <w:r>
+        <w:rPr>
+          <w:rFonts w:ascii="Calibri" w:hAnsi="Calibri"/>
+          <w:b/>
+          <w:color w:val="003366"/>
+          <w:sz w:val="32"/>
+        </w:rPr>
+        <w:t>5. Description of Classes</w:t>
+      </w:r>
+    </w:p>
+    <w:p>
+      <w:pPr>
+        <w:spacing w:before="0" w:after="80"/>
+        <w:ind w:left="288"/>
+      </w:pPr>
+      <w:r>
+        <w:rPr>
+          <w:b/>
+          <w:color w:val="003366"/>
+        </w:rPr>
+        <w:t xml:space="preserve">• Account.java: </w:t>
+      </w:r>
+      <w:r>
+        <w:t>Abstract parent class containing common account information and behavior.</w:t>
+      </w:r>
+    </w:p>
+    <w:p>
+      <w:pPr>
+        <w:spacing w:before="0" w:after="80"/>
+        <w:ind w:left="288"/>
+      </w:pPr>
+      <w:r>
+        <w:rPr>
+          <w:b/>
+          <w:color w:val="003366"/>
+        </w:rPr>
+        <w:t xml:space="preserve">• SavingsAccount.java: </w:t>
+      </w:r>
+      <w:r>
+        <w:t>Represents a Savings Account and implements transaction and loan operations.</w:t>
+      </w:r>
+    </w:p>
+    <w:p>
+      <w:pPr>
+        <w:spacing w:before="0" w:after="80"/>
+        <w:ind w:left="288"/>
+      </w:pPr>
+      <w:r>
+        <w:rPr>
+          <w:b/>
+          <w:color w:val="003366"/>
+        </w:rPr>
+        <w:t xml:space="preserve">• CurrentAccount.java: </w:t>
+      </w:r>
+      <w:r>
+        <w:t>Represents a Current Account and implements transaction and loan operations.</w:t>
+      </w:r>
+    </w:p>
+    <w:p>
+      <w:pPr>
+        <w:spacing w:before="0" w:after="80"/>
+        <w:ind w:left="288"/>
+      </w:pPr>
+      <w:r>
+        <w:rPr>
+          <w:b/>
+          <w:color w:val="003366"/>
+        </w:rPr>
+        <w:t xml:space="preserve">• TransactionService.java: </w:t>
+      </w:r>
+      <w:r>
+        <w:t>Interface that defines deposit and withdrawal operations.</w:t>
+      </w:r>
+    </w:p>
+    <w:p>
+      <w:pPr>
+        <w:spacing w:before="0" w:after="80"/>
+        <w:ind w:left="288"/>
+      </w:pPr>
+      <w:r>
+        <w:rPr>
+          <w:b/>
+          <w:color w:val="003366"/>
+        </w:rPr>
+        <w:t xml:space="preserve">• LoanProcessing.java: </w:t>
+      </w:r>
+      <w:r>
+        <w:t>Interface used for loan processing.</w:t>
+      </w:r>
+    </w:p>
+    <w:p>
+      <w:pPr>
+        <w:spacing w:before="0" w:after="80"/>
+        <w:ind w:left="288"/>
+      </w:pPr>
+      <w:r>
+        <w:rPr>
+          <w:b/>
+          <w:color w:val="003366"/>
+        </w:rPr>
+        <w:t xml:space="preserve">• BankingException.java: </w:t>
+      </w:r>
+      <w:r>
+        <w:t>Custom exception used for banking-related errors.</w:t>
+      </w:r>
+    </w:p>
+    <w:p>
+      <w:pPr>
+        <w:spacing w:before="0" w:after="80"/>
+        <w:ind w:left="288"/>
+      </w:pPr>
+      <w:r>
+        <w:rPr>
+          <w:b/>
+          <w:color w:val="003366"/>
+        </w:rPr>
+        <w:t xml:space="preserve">• Bank.java: </w:t>
+      </w:r>
+      <w:r>
+        <w:t>Handles account creation and maintains the total number of accounts.</w:t>
+      </w:r>
+    </w:p>
+    <w:p>
+      <w:pPr>
+        <w:spacing w:before="0" w:after="80"/>
+        <w:ind w:left="288"/>
+      </w:pPr>
+      <w:r>
+        <w:rPr>
+          <w:b/>
+          <w:color w:val="003366"/>
+        </w:rPr>
+        <w:t xml:space="preserve">• MainApp.java: </w:t>
+      </w:r>
+      <w:r>
+        <w:t>Main driver class containing the main() method and console menu.</w:t>
+      </w:r>
+    </w:p>
+    <w:p>
+      <w:pPr>
+        <w:spacing w:before="0" w:after="80"/>
+        <w:ind w:left="288"/>
+      </w:pPr>
+      <w:r>
+        <w:rPr>
+          <w:b/>
+          <w:color w:val="003366"/>
+        </w:rPr>
+        <w:t xml:space="preserve">• DatabaseConnection.java: </w:t>
+      </w:r>
+      <w:r>
+        <w:t>Establishes the connection between Java and the SQLite database.</w:t>
+      </w:r>
+    </w:p>
+    <w:p>
+      <w:pPr>
+        <w:spacing w:before="0" w:after="80"/>
+        <w:ind w:left="288"/>
+      </w:pPr>
+      <w:r>
+        <w:rPr>
+          <w:b/>
+          <w:color w:val="003366"/>
+        </w:rPr>
+        <w:t xml:space="preserve">• DatabaseSetup.java: </w:t>
+      </w:r>
+      <w:r>
+        <w:t>Creates the database table if it does not already exist.</w:t>
+      </w:r>
+    </w:p>
+    <w:p>
+      <w:pPr>
+        <w:spacing w:before="0" w:after="80"/>
+        <w:ind w:left="288"/>
+      </w:pPr>
+      <w:r>
+        <w:rPr>
+          <w:b/>
+          <w:color w:val="003366"/>
+        </w:rPr>
+        <w:t xml:space="preserve">• AccountDAO.java: </w:t>
+      </w:r>
+      <w:r>
+        <w:t>Performs database operations such as saving accounts and updating account balances.</w:t>
+      </w:r>
+    </w:p>
+    <w:p>
+      <w:pPr>
+        <w:spacing w:before="0" w:after="80"/>
+        <w:ind w:left="288"/>
+      </w:pPr>
+      <w:r>
+        <w:rPr>
+          <w:b/>
+          <w:color w:val="003366"/>
+        </w:rPr>
+        <w:t xml:space="preserve">• DatabaseTest.java: </w:t>
+      </w:r>
+      <w:r>
+        <w:t>Tests whether the SQLite database connection is working.</w:t>
+      </w:r>
+    </w:p>
+    <w:p>
+      <w:pPr>
+        <w:spacing w:before="0" w:after="80"/>
+        <w:ind w:left="288"/>
+      </w:pPr>
+      <w:r>
+        <w:rPr>
+          <w:b/>
+          <w:color w:val="003366"/>
+        </w:rPr>
+        <w:t xml:space="preserve">• AccountViewer.java: </w:t>
+      </w:r>
+      <w:r>
+        <w:t>Retrieves and displays account records stored in the database.</w:t>
+      </w:r>
+    </w:p>
+    <w:p>
+      <w:pPr>
+        <w:spacing w:after="120"/>
+      </w:pPr>
+    </w:p>
+    <w:p>
+      <w:pPr>
+        <w:pStyle w:val="Heading1"/>
+        <w:keepNext/>
+        <w:spacing w:before="240" w:after="120"/>
+      </w:pPr>
+      <w:r>
+        <w:rPr>
+          <w:rFonts w:ascii="Calibri" w:hAnsi="Calibri"/>
+          <w:b/>
+          <w:color w:val="003366"/>
+          <w:sz w:val="32"/>
+        </w:rPr>
+        <w:t>6. Class Relationship</w:t>
+      </w:r>
+    </w:p>
+    <w:p>
+      <w:pPr>
+        <w:spacing w:after="240"/>
+        <w:ind w:left="288"/>
+      </w:pPr>
+      <w:r>
+        <w:rPr>
+          <w:rFonts w:ascii="Consolas" w:hAnsi="Consolas"/>
+          <w:sz w:val="20"/>
+        </w:rPr>
+        <w:t>Account</w:t>
+        <w:br/>
+        <w:t>├── SavingsAccount</w:t>
+        <w:br/>
+        <w:t>│     ├── implements TransactionService</w:t>
+        <w:br/>
+        <w:t>│     └── implements LoanProcessing</w:t>
+        <w:br/>
+        <w:t>│</w:t>
+        <w:br/>
+        <w:t>└── CurrentAccount</w:t>
+        <w:br/>
+        <w:t xml:space="preserve">      ├── implements TransactionService</w:t>
+        <w:br/>
+        <w:t xml:space="preserve">      └── implements LoanProcessing</w:t>
+      </w:r>
+    </w:p>
+    <w:p>
+      <w:pPr>
+        <w:pStyle w:val="Heading1"/>
+        <w:keepNext/>
+        <w:spacing w:before="240" w:after="120"/>
+      </w:pPr>
+      <w:r>
+        <w:rPr>
+          <w:rFonts w:ascii="Calibri" w:hAnsi="Calibri"/>
+          <w:b/>
+          <w:color w:val="003366"/>
+          <w:sz w:val="32"/>
+        </w:rPr>
+        <w:t>7. Account Types</w:t>
+      </w:r>
+    </w:p>
+    <w:p>
+      <w:pPr>
+        <w:pStyle w:val="Heading2"/>
+        <w:keepNext/>
+        <w:spacing w:before="240" w:after="120"/>
+      </w:pPr>
+      <w:r>
+        <w:rPr>
+          <w:rFonts w:ascii="Calibri" w:hAnsi="Calibri"/>
+          <w:b/>
+          <w:color w:val="4682B4"/>
+          <w:sz w:val="26"/>
+        </w:rPr>
+        <w:t>7.1 Savings Account</w:t>
+      </w:r>
+    </w:p>
+    <w:p>
+      <w:pPr>
+        <w:spacing w:after="80"/>
+      </w:pPr>
+      <w:r>
+        <w:t>The Savings Account supports:</w:t>
+      </w:r>
+    </w:p>
+    <w:p>
+      <w:pPr>
+        <w:pStyle w:val="ListBullet"/>
+        <w:spacing w:after="40"/>
+      </w:pPr>
+      <w:r>
+        <w:t>Deposit</w:t>
+      </w:r>
+    </w:p>
+    <w:p>
+      <w:pPr>
+        <w:pStyle w:val="ListBullet"/>
+        <w:spacing w:after="40"/>
+      </w:pPr>
+      <w:r>
+        <w:t>Withdrawal</w:t>
+      </w:r>
+    </w:p>
+    <w:p>
+      <w:pPr>
+        <w:pStyle w:val="ListBullet"/>
+        <w:spacing w:after="40"/>
+      </w:pPr>
+      <w:r>
+        <w:t>Savings interest calculation</w:t>
+      </w:r>
+    </w:p>
+    <w:p>
+      <w:pPr>
+        <w:pStyle w:val="ListBullet"/>
+        <w:spacing w:after="40"/>
+      </w:pPr>
+      <w:r>
+        <w:t>Loan processing</w:t>
+      </w:r>
+    </w:p>
+    <w:p>
+      <w:pPr>
+        <w:pStyle w:val="Heading2"/>
+        <w:keepNext/>
+        <w:spacing w:before="240" w:after="120"/>
+      </w:pPr>
+      <w:r>
+        <w:rPr>
+          <w:rFonts w:ascii="Calibri" w:hAnsi="Calibri"/>
+          <w:b/>
+          <w:color w:val="4682B4"/>
+          <w:sz w:val="26"/>
+        </w:rPr>
+        <w:t>7.2 Current Account</w:t>
+      </w:r>
+    </w:p>
+    <w:p>
+      <w:pPr>
+        <w:spacing w:after="80"/>
+      </w:pPr>
+      <w:r>
+        <w:t>The Current Account supports:</w:t>
+      </w:r>
+    </w:p>
+    <w:p>
+      <w:pPr>
+        <w:pStyle w:val="ListBullet"/>
+        <w:spacing w:after="40"/>
+      </w:pPr>
+      <w:r>
+        <w:t>Deposit</w:t>
+      </w:r>
+    </w:p>
+    <w:p>
+      <w:pPr>
+        <w:pStyle w:val="ListBullet"/>
+        <w:spacing w:after="40"/>
+      </w:pPr>
+      <w:r>
+        <w:t>Withdrawal</w:t>
+      </w:r>
+    </w:p>
+    <w:p>
+      <w:pPr>
+        <w:pStyle w:val="ListBullet"/>
+        <w:spacing w:after="40"/>
+      </w:pPr>
+      <w:r>
+        <w:t>Account display</w:t>
+      </w:r>
+    </w:p>
+    <w:p>
+      <w:pPr>
+        <w:pStyle w:val="ListBullet"/>
+        <w:spacing w:after="40"/>
+      </w:pPr>
+      <w:r>
+        <w:t>Business loan processing</w:t>
+      </w:r>
+    </w:p>
+    <w:p>
+      <w:pPr>
+        <w:spacing w:before="80" w:after="240"/>
+      </w:pPr>
+      <w:r>
+        <w:rPr>
+          <w:i/>
+        </w:rPr>
+        <w:t>Note: The Current Account does not provide savings interest.</w:t>
+      </w:r>
+    </w:p>
+    <w:p>
+      <w:pPr>
+        <w:pStyle w:val="Heading1"/>
+        <w:keepNext/>
+        <w:spacing w:before="240" w:after="120"/>
+      </w:pPr>
+      <w:r>
+        <w:rPr>
+          <w:rFonts w:ascii="Calibri" w:hAnsi="Calibri"/>
+          <w:b/>
+          <w:color w:val="003366"/>
+          <w:sz w:val="32"/>
+        </w:rPr>
+        <w:t>8. Functionalities</w:t>
+      </w:r>
+    </w:p>
+    <w:p>
+      <w:pPr>
+        <w:pStyle w:val="ListBullet"/>
+        <w:spacing w:after="40"/>
+      </w:pPr>
+      <w:r>
+        <w:t>Create an account</w:t>
+      </w:r>
+    </w:p>
+    <w:p>
+      <w:pPr>
+        <w:pStyle w:val="ListBullet"/>
+        <w:spacing w:after="40"/>
+      </w:pPr>
+      <w:r>
+        <w:t>Deposit money</w:t>
+      </w:r>
+    </w:p>
+    <w:p>
+      <w:pPr>
+        <w:pStyle w:val="ListBullet"/>
+        <w:spacing w:after="40"/>
+      </w:pPr>
+      <w:r>
+        <w:t>Withdraw money</w:t>
+      </w:r>
+    </w:p>
+    <w:p>
+      <w:pPr>
+        <w:pStyle w:val="ListBullet"/>
+        <w:spacing w:after="40"/>
+      </w:pPr>
+      <w:r>
+        <w:t>Display account details</w:t>
+      </w:r>
+    </w:p>
+    <w:p>
+      <w:pPr>
+        <w:pStyle w:val="ListBullet"/>
+        <w:spacing w:after="40"/>
+      </w:pPr>
+      <w:r>
+        <w:t>Calculate interest</w:t>
+      </w:r>
+    </w:p>
+    <w:p>
+      <w:pPr>
+        <w:pStyle w:val="ListBullet"/>
+        <w:spacing w:after="40"/>
+      </w:pPr>
+      <w:r>
+        <w:t>Apply for a loan</w:t>
+      </w:r>
+    </w:p>
+    <w:p>
+      <w:pPr>
+        <w:pStyle w:val="ListBullet"/>
+        <w:spacing w:after="40"/>
+      </w:pPr>
+      <w:r>
+        <w:t>Store account information in the database</w:t>
+      </w:r>
+    </w:p>
+    <w:p>
+      <w:pPr>
+        <w:pStyle w:val="ListBullet"/>
+        <w:spacing w:after="40"/>
+      </w:pPr>
+      <w:r>
+        <w:t>Update balance in the database</w:t>
+      </w:r>
+    </w:p>
+    <w:p>
+      <w:pPr>
+        <w:pStyle w:val="ListBullet"/>
+        <w:spacing w:after="40"/>
+      </w:pPr>
+      <w:r>
+        <w:t>Retrieve account records</w:t>
+      </w:r>
+    </w:p>
+    <w:p>
+      <w:pPr>
+        <w:pStyle w:val="ListBullet"/>
+        <w:spacing w:after="40"/>
+      </w:pPr>
+      <w:r>
+        <w:t>Exit the application</w:t>
+      </w:r>
+    </w:p>
+    <w:p>
+      <w:pPr>
+        <w:spacing w:after="120"/>
+      </w:pPr>
+    </w:p>
+    <w:p>
+      <w:pPr>
+        <w:pStyle w:val="Heading1"/>
+        <w:keepNext/>
+        <w:spacing w:before="240" w:after="120"/>
+      </w:pPr>
+      <w:r>
+        <w:rPr>
+          <w:rFonts w:ascii="Calibri" w:hAnsi="Calibri"/>
+          <w:b/>
+          <w:color w:val="003366"/>
+          <w:sz w:val="32"/>
+        </w:rPr>
+        <w:t>9. Database Implementation</w:t>
+      </w:r>
+    </w:p>
+    <w:p>
+      <w:pPr>
+        <w:spacing w:after="80"/>
+      </w:pPr>
+      <w:r>
+        <w:t>The project uses SQLite as its database.</w:t>
+      </w:r>
+    </w:p>
+    <w:p>
+      <w:pPr>
+        <w:spacing w:after="160"/>
+      </w:pPr>
+      <w:r>
+        <w:rPr>
+          <w:b/>
+        </w:rPr>
+        <w:t xml:space="preserve">• Database File: </w:t>
+      </w:r>
+      <w:r>
+        <w:t>banking.db</w:t>
+        <w:br/>
+      </w:r>
+      <w:r>
+        <w:rPr>
+          <w:b/>
+        </w:rPr>
+        <w:t xml:space="preserve">• SQLite JDBC Driver: </w:t>
+      </w:r>
+      <w:r>
+        <w:t>sqlite-jdbc-3.53.2.1.jar</w:t>
+      </w:r>
+    </w:p>
+    <w:p>
+      <w:pPr>
+        <w:pStyle w:val="Heading2"/>
+        <w:keepNext/>
+        <w:spacing w:before="240" w:after="120"/>
+      </w:pPr>
+      <w:r>
+        <w:rPr>
+          <w:rFonts w:ascii="Calibri" w:hAnsi="Calibri"/>
+          <w:b/>
+          <w:color w:val="4682B4"/>
+          <w:sz w:val="26"/>
+        </w:rPr>
+        <w:t>9.1 Database Table Specification</w:t>
+      </w:r>
+    </w:p>
+    <w:tbl>
+      <w:tblPr>
+        <w:tblW w:type="auto" w:w="0"/>
+        <w:jc w:val="center"/>
+        <w:tblLook w:firstColumn="1" w:firstRow="1" w:lastColumn="0" w:lastRow="0" w:noHBand="0" w:noVBand="1" w:val="04A0"/>
+        <w:tblBorders>
+          <w:top w:val="single" w:sz="4" w:space="0" w:color="CCCCCC"/>
+          <w:bottom w:val="single" w:sz="4" w:space="0" w:color="CCCCCC"/>
+          <w:left w:val="none"/>
+          <w:right w:val="none"/>
+          <w:insideH w:val="single" w:sz="4" w:space="0" w:color="CCCCCC"/>
+          <w:insideV w:val="none"/>
+        </w:tblBorders>
+      </w:tblPr>
+      <w:tblGrid>
+        <w:gridCol w:w="2592"/>
+        <w:gridCol w:w="1728"/>
+        <w:gridCol w:w="2160"/>
+        <w:gridCol w:w="2880"/>
+      </w:tblGrid>
+      <w:tr>
+        <w:tc>
+          <w:tcPr>
+            <w:tcW w:type="dxa" w:w="2340"/>
+            <w:vAlign w:val="center"/>
+            <w:tcMar>
+              <w:top w:w="100" w:type="dxa"/>
+              <w:bottom w:w="100" w:type="dxa"/>
+              <w:left w:w="120" w:type="dxa"/>
+              <w:right w:w="120" w:type="dxa"/>
+            </w:tcMar>
+            <w:shd w:fill="003366"/>
+          </w:tcPr>
+          <w:p>
+            <w:pPr>
+              <w:spacing w:before="0" w:after="0"/>
+            </w:pPr>
+            <w:r>
+              <w:rPr>
+                <w:b/>
+                <w:color w:val="FFFFFF"/>
+              </w:rPr>
+              <w:t>Column</w:t>
+            </w:r>
+          </w:p>
+        </w:tc>
+        <w:tc>
+          <w:tcPr>
+            <w:tcW w:type="dxa" w:w="2340"/>
+            <w:vAlign w:val="center"/>
+            <w:tcMar>
+              <w:top w:w="100" w:type="dxa"/>
+              <w:bottom w:w="100" w:type="dxa"/>
+              <w:left w:w="120" w:type="dxa"/>
+              <w:right w:w="120" w:type="dxa"/>
+            </w:tcMar>
+            <w:shd w:fill="003366"/>
+          </w:tcPr>
+          <w:p>
+            <w:pPr>
+              <w:spacing w:before="0" w:after="0"/>
+            </w:pPr>
+            <w:r>
+              <w:rPr>
+                <w:b/>
+                <w:color w:val="FFFFFF"/>
+              </w:rPr>
+              <w:t>Data Type</w:t>
+            </w:r>
+          </w:p>
+        </w:tc>
+        <w:tc>
+          <w:tcPr>
+            <w:tcW w:type="dxa" w:w="2340"/>
+            <w:vAlign w:val="center"/>
+            <w:tcMar>
+              <w:top w:w="100" w:type="dxa"/>
+              <w:bottom w:w="100" w:type="dxa"/>
+              <w:left w:w="120" w:type="dxa"/>
+              <w:right w:w="120" w:type="dxa"/>
+            </w:tcMar>
+            <w:shd w:fill="003366"/>
+          </w:tcPr>
+          <w:p>
+            <w:pPr>
+              <w:spacing w:before="0" w:after="0"/>
+            </w:pPr>
+            <w:r>
+              <w:rPr>
+                <w:b/>
+                <w:color w:val="FFFFFF"/>
+              </w:rPr>
+              <w:t>Constraint</w:t>
+            </w:r>
+          </w:p>
+        </w:tc>
+        <w:tc>
+          <w:tcPr>
+            <w:tcW w:type="dxa" w:w="2340"/>
+            <w:vAlign w:val="center"/>
+            <w:tcMar>
+              <w:top w:w="100" w:type="dxa"/>
+              <w:bottom w:w="100" w:type="dxa"/>
+              <w:left w:w="120" w:type="dxa"/>
+              <w:right w:w="120" w:type="dxa"/>
+            </w:tcMar>
+            <w:shd w:fill="003366"/>
+          </w:tcPr>
+          <w:p>
+            <w:pPr>
+              <w:spacing w:before="0" w:after="0"/>
+            </w:pPr>
+            <w:r>
+              <w:rPr>
+                <w:b/>
+                <w:color w:val="FFFFFF"/>
+              </w:rPr>
+              <w:t>Description</w:t>
             </w:r>
           </w:p>
         </w:tc>
@@ -430,31 +1653,89 @@
       <w:tr>
         <w:tc>
           <w:tcPr>
-            <w:tcW w:type="dxa" w:w="2880"/>
+            <w:tcW w:type="dxa" w:w="2340"/>
+            <w:vAlign w:val="center"/>
+            <w:tcMar>
+              <w:top w:w="100" w:type="dxa"/>
+              <w:bottom w:w="100" w:type="dxa"/>
+              <w:left w:w="120" w:type="dxa"/>
+              <w:right w:w="120" w:type="dxa"/>
+            </w:tcMar>
+            <w:shd w:fill="F5F7FA"/>
           </w:tcPr>
           <w:p>
+            <w:pPr>
+              <w:spacing w:before="0" w:after="0"/>
+            </w:pPr>
             <w:r>
-              <w:t>Static</w:t>
+              <w:rPr>
+                <w:rFonts w:ascii="Consolas" w:hAnsi="Consolas"/>
+                <w:sz w:val="19"/>
+              </w:rPr>
+              <w:t>account_number</w:t>
             </w:r>
           </w:p>
         </w:tc>
         <w:tc>
           <w:tcPr>
-            <w:tcW w:type="dxa" w:w="2880"/>
+            <w:tcW w:type="dxa" w:w="2340"/>
+            <w:vAlign w:val="center"/>
+            <w:tcMar>
+              <w:top w:w="100" w:type="dxa"/>
+              <w:bottom w:w="100" w:type="dxa"/>
+              <w:left w:w="120" w:type="dxa"/>
+              <w:right w:w="120" w:type="dxa"/>
+            </w:tcMar>
+            <w:shd w:fill="F5F7FA"/>
           </w:tcPr>
           <w:p>
+            <w:pPr>
+              <w:spacing w:before="0" w:after="0"/>
+            </w:pPr>
             <w:r>
-              <w:t>Bank</w:t>
+              <w:t>TEXT</w:t>
             </w:r>
           </w:p>
         </w:tc>
         <w:tc>
           <w:tcPr>
-            <w:tcW w:type="dxa" w:w="2880"/>
+            <w:tcW w:type="dxa" w:w="2340"/>
+            <w:vAlign w:val="center"/>
+            <w:tcMar>
+              <w:top w:w="100" w:type="dxa"/>
+              <w:bottom w:w="100" w:type="dxa"/>
+              <w:left w:w="120" w:type="dxa"/>
+              <w:right w:w="120" w:type="dxa"/>
+            </w:tcMar>
+            <w:shd w:fill="F5F7FA"/>
           </w:tcPr>
           <w:p>
+            <w:pPr>
+              <w:spacing w:before="0" w:after="0"/>
+            </w:pPr>
             <w:r>
-              <w:t>Maintains total account count.</w:t>
+              <w:t>PRIMARY KEY</w:t>
+            </w:r>
+          </w:p>
+        </w:tc>
+        <w:tc>
+          <w:tcPr>
+            <w:tcW w:type="dxa" w:w="2340"/>
+            <w:vAlign w:val="center"/>
+            <w:tcMar>
+              <w:top w:w="100" w:type="dxa"/>
+              <w:bottom w:w="100" w:type="dxa"/>
+              <w:left w:w="120" w:type="dxa"/>
+              <w:right w:w="120" w:type="dxa"/>
+            </w:tcMar>
+            <w:shd w:fill="F5F7FA"/>
+          </w:tcPr>
+          <w:p>
+            <w:pPr>
+              <w:spacing w:before="0" w:after="0"/>
+            </w:pPr>
+            <w:r>
+              <w:t>Unique account number</w:t>
             </w:r>
           </w:p>
         </w:tc>
@@ -462,31 +1743,89 @@
       <w:tr>
         <w:tc>
           <w:tcPr>
-            <w:tcW w:type="dxa" w:w="2880"/>
+            <w:tcW w:type="dxa" w:w="2340"/>
+            <w:vAlign w:val="center"/>
+            <w:tcMar>
+              <w:top w:w="100" w:type="dxa"/>
+              <w:bottom w:w="100" w:type="dxa"/>
+              <w:left w:w="120" w:type="dxa"/>
+              <w:right w:w="120" w:type="dxa"/>
+            </w:tcMar>
+            <w:shd w:fill="FFFFFF"/>
           </w:tcPr>
           <w:p>
+            <w:pPr>
+              <w:spacing w:before="0" w:after="0"/>
+            </w:pPr>
             <w:r>
-              <w:t>Final</w:t>
+              <w:rPr>
+                <w:rFonts w:ascii="Consolas" w:hAnsi="Consolas"/>
+                <w:sz w:val="19"/>
+              </w:rPr>
+              <w:t>holder_name</w:t>
             </w:r>
           </w:p>
         </w:tc>
         <w:tc>
           <w:tcPr>
-            <w:tcW w:type="dxa" w:w="2880"/>
+            <w:tcW w:type="dxa" w:w="2340"/>
+            <w:vAlign w:val="center"/>
+            <w:tcMar>
+              <w:top w:w="100" w:type="dxa"/>
+              <w:bottom w:w="100" w:type="dxa"/>
+              <w:left w:w="120" w:type="dxa"/>
+              <w:right w:w="120" w:type="dxa"/>
+            </w:tcMar>
+            <w:shd w:fill="FFFFFF"/>
           </w:tcPr>
           <w:p>
+            <w:pPr>
+              <w:spacing w:before="0" w:after="0"/>
+            </w:pPr>
             <w:r>
-              <w:t>Account</w:t>
+              <w:t>TEXT</w:t>
             </w:r>
           </w:p>
         </w:tc>
         <w:tc>
           <w:tcPr>
-            <w:tcW w:type="dxa" w:w="2880"/>
+            <w:tcW w:type="dxa" w:w="2340"/>
+            <w:vAlign w:val="center"/>
+            <w:tcMar>
+              <w:top w:w="100" w:type="dxa"/>
+              <w:bottom w:w="100" w:type="dxa"/>
+              <w:left w:w="120" w:type="dxa"/>
+              <w:right w:w="120" w:type="dxa"/>
+            </w:tcMar>
+            <w:shd w:fill="FFFFFF"/>
           </w:tcPr>
           <w:p>
+            <w:pPr>
+              <w:spacing w:before="0" w:after="0"/>
+            </w:pPr>
             <w:r>
-              <w:t>BANK_NAME is a constant.</w:t>
+              <w:t>NOT NULL</w:t>
+            </w:r>
+          </w:p>
+        </w:tc>
+        <w:tc>
+          <w:tcPr>
+            <w:tcW w:type="dxa" w:w="2340"/>
+            <w:vAlign w:val="center"/>
+            <w:tcMar>
+              <w:top w:w="100" w:type="dxa"/>
+              <w:bottom w:w="100" w:type="dxa"/>
+              <w:left w:w="120" w:type="dxa"/>
+              <w:right w:w="120" w:type="dxa"/>
+            </w:tcMar>
+            <w:shd w:fill="FFFFFF"/>
+          </w:tcPr>
+          <w:p>
+            <w:pPr>
+              <w:spacing w:before="0" w:after="0"/>
+            </w:pPr>
+            <w:r>
+              <w:t>Account holder name</w:t>
             </w:r>
           </w:p>
         </w:tc>
@@ -494,31 +1833,89 @@
       <w:tr>
         <w:tc>
           <w:tcPr>
-            <w:tcW w:type="dxa" w:w="2880"/>
+            <w:tcW w:type="dxa" w:w="2340"/>
+            <w:vAlign w:val="center"/>
+            <w:tcMar>
+              <w:top w:w="100" w:type="dxa"/>
+              <w:bottom w:w="100" w:type="dxa"/>
+              <w:left w:w="120" w:type="dxa"/>
+              <w:right w:w="120" w:type="dxa"/>
+            </w:tcMar>
+            <w:shd w:fill="F5F7FA"/>
           </w:tcPr>
           <w:p>
+            <w:pPr>
+              <w:spacing w:before="0" w:after="0"/>
+            </w:pPr>
             <w:r>
-              <w:t>Method Overloading</w:t>
+              <w:rPr>
+                <w:rFonts w:ascii="Consolas" w:hAnsi="Consolas"/>
+                <w:sz w:val="19"/>
+              </w:rPr>
+              <w:t>balance</w:t>
             </w:r>
           </w:p>
         </w:tc>
         <w:tc>
           <w:tcPr>
-            <w:tcW w:type="dxa" w:w="2880"/>
+            <w:tcW w:type="dxa" w:w="2340"/>
+            <w:vAlign w:val="center"/>
+            <w:tcMar>
+              <w:top w:w="100" w:type="dxa"/>
+              <w:bottom w:w="100" w:type="dxa"/>
+              <w:left w:w="120" w:type="dxa"/>
+              <w:right w:w="120" w:type="dxa"/>
+            </w:tcMar>
+            <w:shd w:fill="F5F7FA"/>
           </w:tcPr>
           <w:p>
+            <w:pPr>
+              <w:spacing w:before="0" w:after="0"/>
+            </w:pPr>
             <w:r>
-              <w:t>Bank</w:t>
+              <w:t>REAL</w:t>
             </w:r>
           </w:p>
         </w:tc>
         <w:tc>
           <w:tcPr>
-            <w:tcW w:type="dxa" w:w="2880"/>
+            <w:tcW w:type="dxa" w:w="2340"/>
+            <w:vAlign w:val="center"/>
+            <w:tcMar>
+              <w:top w:w="100" w:type="dxa"/>
+              <w:bottom w:w="100" w:type="dxa"/>
+              <w:left w:w="120" w:type="dxa"/>
+              <w:right w:w="120" w:type="dxa"/>
+            </w:tcMar>
+            <w:shd w:fill="F5F7FA"/>
           </w:tcPr>
           <w:p>
+            <w:pPr>
+              <w:spacing w:before="0" w:after="0"/>
+            </w:pPr>
             <w:r>
-              <w:t>Two createAccount() methods use different parameters.</w:t>
+              <w:t>NOT NULL</w:t>
+            </w:r>
+          </w:p>
+        </w:tc>
+        <w:tc>
+          <w:tcPr>
+            <w:tcW w:type="dxa" w:w="2340"/>
+            <w:vAlign w:val="center"/>
+            <w:tcMar>
+              <w:top w:w="100" w:type="dxa"/>
+              <w:bottom w:w="100" w:type="dxa"/>
+              <w:left w:w="120" w:type="dxa"/>
+              <w:right w:w="120" w:type="dxa"/>
+            </w:tcMar>
+            <w:shd w:fill="F5F7FA"/>
+          </w:tcPr>
+          <w:p>
+            <w:pPr>
+              <w:spacing w:before="0" w:after="0"/>
+            </w:pPr>
+            <w:r>
+              <w:t>Current balance</w:t>
             </w:r>
           </w:p>
         </w:tc>
@@ -526,31 +1923,89 @@
       <w:tr>
         <w:tc>
           <w:tcPr>
-            <w:tcW w:type="dxa" w:w="2880"/>
+            <w:tcW w:type="dxa" w:w="2340"/>
+            <w:vAlign w:val="center"/>
+            <w:tcMar>
+              <w:top w:w="100" w:type="dxa"/>
+              <w:bottom w:w="100" w:type="dxa"/>
+              <w:left w:w="120" w:type="dxa"/>
+              <w:right w:w="120" w:type="dxa"/>
+            </w:tcMar>
+            <w:shd w:fill="FFFFFF"/>
           </w:tcPr>
           <w:p>
+            <w:pPr>
+              <w:spacing w:before="0" w:after="0"/>
+            </w:pPr>
             <w:r>
-              <w:t>Default Method</w:t>
+              <w:rPr>
+                <w:rFonts w:ascii="Consolas" w:hAnsi="Consolas"/>
+                <w:sz w:val="19"/>
+              </w:rPr>
+              <w:t>account_type</w:t>
             </w:r>
           </w:p>
         </w:tc>
         <w:tc>
           <w:tcPr>
-            <w:tcW w:type="dxa" w:w="2880"/>
+            <w:tcW w:type="dxa" w:w="2340"/>
+            <w:vAlign w:val="center"/>
+            <w:tcMar>
+              <w:top w:w="100" w:type="dxa"/>
+              <w:bottom w:w="100" w:type="dxa"/>
+              <w:left w:w="120" w:type="dxa"/>
+              <w:right w:w="120" w:type="dxa"/>
+            </w:tcMar>
+            <w:shd w:fill="FFFFFF"/>
           </w:tcPr>
           <w:p>
+            <w:pPr>
+              <w:spacing w:before="0" w:after="0"/>
+            </w:pPr>
             <w:r>
-              <w:t>TransactionService</w:t>
+              <w:t>TEXT</w:t>
             </w:r>
           </w:p>
         </w:tc>
         <w:tc>
           <w:tcPr>
-            <w:tcW w:type="dxa" w:w="2880"/>
+            <w:tcW w:type="dxa" w:w="2340"/>
+            <w:vAlign w:val="center"/>
+            <w:tcMar>
+              <w:top w:w="100" w:type="dxa"/>
+              <w:bottom w:w="100" w:type="dxa"/>
+              <w:left w:w="120" w:type="dxa"/>
+              <w:right w:w="120" w:type="dxa"/>
+            </w:tcMar>
+            <w:shd w:fill="FFFFFF"/>
           </w:tcPr>
           <w:p>
+            <w:pPr>
+              <w:spacing w:before="0" w:after="0"/>
+            </w:pPr>
             <w:r>
-              <w:t>Provides a default log() method.</w:t>
+              <w:t>NOT NULL</w:t>
+            </w:r>
+          </w:p>
+        </w:tc>
+        <w:tc>
+          <w:tcPr>
+            <w:tcW w:type="dxa" w:w="2340"/>
+            <w:vAlign w:val="center"/>
+            <w:tcMar>
+              <w:top w:w="100" w:type="dxa"/>
+              <w:bottom w:w="100" w:type="dxa"/>
+              <w:left w:w="120" w:type="dxa"/>
+              <w:right w:w="120" w:type="dxa"/>
+            </w:tcMar>
+            <w:shd w:fill="FFFFFF"/>
+          </w:tcPr>
+          <w:p>
+            <w:pPr>
+              <w:spacing w:before="0" w:after="0"/>
+            </w:pPr>
+            <w:r>
+              <w:t>Savings or Current</w:t>
             </w:r>
           </w:p>
         </w:tc>
@@ -558,299 +2013,395 @@
     </w:tbl>
     <w:p>
       <w:pPr>
-        <w:pStyle w:val="Heading1"/>
+        <w:pStyle w:val="Heading2"/>
+        <w:keepNext/>
+        <w:spacing w:before="240" w:after="120"/>
       </w:pPr>
       <w:r>
-        <w:t>4. Project Structure</w:t>
+        <w:rPr>
+          <w:rFonts w:ascii="Calibri" w:hAnsi="Calibri"/>
+          <w:b/>
+          <w:color w:val="4682B4"/>
+          <w:sz w:val="26"/>
+        </w:rPr>
+        <w:t>9.2 Database Classes</w:t>
       </w:r>
     </w:p>
     <w:p>
       <w:pPr>
-        <w:pStyle w:val="ListBullet"/>
+        <w:spacing w:after="60"/>
+        <w:ind w:left="288"/>
       </w:pPr>
       <w:r>
-        <w:t>Account.java - Abstract parent class containing common account information and behavior.</w:t>
+        <w:rPr>
+          <w:b/>
+        </w:rPr>
+        <w:t xml:space="preserve">• DatabaseConnection.java: </w:t>
+      </w:r>
+      <w:r>
+        <w:t>Connects the Java application to banking.db.</w:t>
       </w:r>
     </w:p>
     <w:p>
       <w:pPr>
-        <w:pStyle w:val="ListBullet"/>
+        <w:spacing w:after="60"/>
+        <w:ind w:left="288"/>
       </w:pPr>
       <w:r>
-        <w:t>SavingsAccount.java - Represents a Savings Account and implements transaction and loan operations.</w:t>
+        <w:rPr>
+          <w:b/>
+        </w:rPr>
+        <w:t xml:space="preserve">• DatabaseSetup.java: </w:t>
+      </w:r>
+      <w:r>
+        <w:t>Creates the accounts table.</w:t>
       </w:r>
     </w:p>
     <w:p>
       <w:pPr>
-        <w:pStyle w:val="ListBullet"/>
+        <w:spacing w:after="60"/>
+        <w:ind w:left="288"/>
       </w:pPr>
       <w:r>
-        <w:t>CurrentAccount.java - Represents a Current Account and implements transaction and loan operations.</w:t>
+        <w:rPr>
+          <w:b/>
+        </w:rPr>
+        <w:t xml:space="preserve">• AccountDAO.java: </w:t>
+      </w:r>
+      <w:r>
+        <w:t>Inserts new accounts and updates account balances.</w:t>
       </w:r>
     </w:p>
     <w:p>
       <w:pPr>
-        <w:pStyle w:val="ListBullet"/>
+        <w:spacing w:after="60"/>
+        <w:ind w:left="288"/>
       </w:pPr>
       <w:r>
-        <w:t>TransactionService.java - Interface for deposit and withdrawal operations.</w:t>
+        <w:rPr>
+          <w:b/>
+        </w:rPr>
+        <w:t xml:space="preserve">• DatabaseTest.java: </w:t>
+      </w:r>
+      <w:r>
+        <w:t>Checks whether the database connection is successful.</w:t>
       </w:r>
     </w:p>
     <w:p>
       <w:pPr>
-        <w:pStyle w:val="ListBullet"/>
+        <w:spacing w:after="60"/>
+        <w:ind w:left="288"/>
       </w:pPr>
       <w:r>
-        <w:t>LoanProcessing.java - Interface for loan processing.</w:t>
+        <w:rPr>
+          <w:b/>
+        </w:rPr>
+        <w:t xml:space="preserve">• AccountViewer.java: </w:t>
+      </w:r>
+      <w:r>
+        <w:t>Retrieves and displays stored accounts.</w:t>
       </w:r>
     </w:p>
     <w:p>
       <w:pPr>
-        <w:pStyle w:val="ListBullet"/>
+        <w:pStyle w:val="Heading2"/>
+        <w:keepNext/>
+        <w:spacing w:before="240" w:after="120"/>
       </w:pPr>
       <w:r>
-        <w:t>BankingException.java - Custom exception for banking transaction errors.</w:t>
+        <w:rPr>
+          <w:rFonts w:ascii="Calibri" w:hAnsi="Calibri"/>
+          <w:b/>
+          <w:color w:val="4682B4"/>
+          <w:sz w:val="26"/>
+        </w:rPr>
+        <w:t>9.3 Database Flow</w:t>
       </w:r>
     </w:p>
     <w:p>
       <w:pPr>
-        <w:pStyle w:val="ListBullet"/>
+        <w:spacing w:after="240"/>
+        <w:ind w:left="576"/>
       </w:pPr>
       <w:r>
-        <w:t>Bank.java - Handles account creation and maintains the total account count.</w:t>
+        <w:rPr>
+          <w:rFonts w:ascii="Consolas" w:hAnsi="Consolas"/>
+          <w:sz w:val="19"/>
+        </w:rPr>
+        <w:t>MainApp</w:t>
+        <w:br/>
+        <w:t xml:space="preserve">   ↓</w:t>
+        <w:br/>
+        <w:t>Account / SavingsAccount / CurrentAccount</w:t>
+        <w:br/>
+        <w:t xml:space="preserve">   ↓</w:t>
+        <w:br/>
+        <w:t>AccountDAO</w:t>
+        <w:br/>
+        <w:t xml:space="preserve">   ↓</w:t>
+        <w:br/>
+        <w:t>DatabaseConnection</w:t>
+        <w:br/>
+        <w:t xml:space="preserve">   ↓</w:t>
+        <w:br/>
+        <w:t>SQLite</w:t>
+        <w:br/>
+        <w:t xml:space="preserve">   ↓</w:t>
+        <w:br/>
+        <w:t>banking.db</w:t>
+        <w:br/>
+        <w:t xml:space="preserve">   ↓</w:t>
+        <w:br/>
+        <w:t>accounts table</w:t>
       </w:r>
     </w:p>
     <w:p>
       <w:pPr>
-        <w:pStyle w:val="ListBullet"/>
+        <w:pStyle w:val="Heading1"/>
+        <w:keepNext/>
+        <w:spacing w:before="240" w:after="120"/>
       </w:pPr>
       <w:r>
-        <w:t>MainApp.java - Driver class containing the main method and console menu.</w:t>
+        <w:rPr>
+          <w:rFonts w:ascii="Calibri" w:hAnsi="Calibri"/>
+          <w:b/>
+          <w:color w:val="003366"/>
+          <w:sz w:val="32"/>
+        </w:rPr>
+        <w:t>10. Program Flow</w:t>
       </w:r>
     </w:p>
     <w:p>
       <w:pPr>
-        <w:pStyle w:val="Heading1"/>
+        <w:spacing w:after="60"/>
       </w:pPr>
       <w:r>
-        <w:t>5. Class Relationship</w:t>
+        <w:rPr>
+          <w:b/>
+          <w:color w:val="003366"/>
+        </w:rPr>
+        <w:t xml:space="preserve">1. </w:t>
+      </w:r>
+      <w:r>
+        <w:t>Start MainApp.</w:t>
       </w:r>
     </w:p>
     <w:p>
+      <w:pPr>
+        <w:spacing w:after="60"/>
+      </w:pPr>
       <w:r>
-        <w:t>Account is the abstract parent class. SavingsAccount and CurrentAccount inherit from Account. Both child classes implement TransactionService and LoanProcessing.</w:t>
+        <w:rPr>
+          <w:b/>
+          <w:color w:val="003366"/>
+        </w:rPr>
+        <w:t xml:space="preserve">2. </w:t>
+      </w:r>
+      <w:r>
+        <w:t>Enter account number.</w:t>
       </w:r>
     </w:p>
     <w:p>
+      <w:pPr>
+        <w:spacing w:after="60"/>
+      </w:pPr>
       <w:r>
-        <w:t>Account</w:t>
-        <w:br/>
-        <w:t>├── SavingsAccount ── implements TransactionService, LoanProcessing</w:t>
-        <w:br/>
-        <w:t>└── CurrentAccount ── implements TransactionService, LoanProcessing</w:t>
+        <w:rPr>
+          <w:b/>
+          <w:color w:val="003366"/>
+        </w:rPr>
+        <w:t xml:space="preserve">3. </w:t>
+      </w:r>
+      <w:r>
+        <w:t>Enter account holder name.</w:t>
       </w:r>
     </w:p>
     <w:p>
       <w:pPr>
-        <w:pStyle w:val="Heading1"/>
+        <w:spacing w:after="60"/>
       </w:pPr>
       <w:r>
-        <w:t>6. Account Types</w:t>
+        <w:rPr>
+          <w:b/>
+          <w:color w:val="003366"/>
+        </w:rPr>
+        <w:t xml:space="preserve">4. </w:t>
+      </w:r>
+      <w:r>
+        <w:t>Enter initial balance.</w:t>
       </w:r>
     </w:p>
     <w:p>
       <w:pPr>
-        <w:pStyle w:val="Heading2"/>
+        <w:spacing w:after="60"/>
       </w:pPr>
       <w:r>
-        <w:t>6.1 Savings Account</w:t>
+        <w:rPr>
+          <w:b/>
+          <w:color w:val="003366"/>
+        </w:rPr>
+        <w:t xml:space="preserve">5. </w:t>
       </w:r>
-    </w:p>
-    <w:p>
-      <w:r>
-        <w:t>The SavingsAccount class supports deposit and withdrawal operations and calculates 4% interest on the current balance. A withdrawal is rejected when the requested amount is greater than the balance.</w:t>
-      </w:r>
-    </w:p>
-    <w:p>
-      <w:pPr>
-        <w:pStyle w:val="Heading2"/>
-      </w:pPr>
-      <w:r>
-        <w:t>6.2 Current Account</w:t>
-      </w:r>
-    </w:p>
-    <w:p>
-      <w:r>
-        <w:t>The CurrentAccount class supports deposit and withdrawal operations. It allows an overdraft limit of 5000 and does not add savings interest.</w:t>
-      </w:r>
-    </w:p>
-    <w:p>
-      <w:pPr>
-        <w:pStyle w:val="Heading1"/>
-      </w:pPr>
-      <w:r>
-        <w:t>7. Functionalities</w:t>
-      </w:r>
-    </w:p>
-    <w:p>
-      <w:pPr>
-        <w:pStyle w:val="ListBullet"/>
-      </w:pPr>
-      <w:r>
-        <w:t>Create a Savings or Current Account.</w:t>
-      </w:r>
-    </w:p>
-    <w:p>
-      <w:pPr>
-        <w:pStyle w:val="ListBullet"/>
-      </w:pPr>
-      <w:r>
-        <w:t>Deposit money into the account.</w:t>
-      </w:r>
-    </w:p>
-    <w:p>
-      <w:pPr>
-        <w:pStyle w:val="ListBullet"/>
-      </w:pPr>
-      <w:r>
-        <w:t>Withdraw money from the account.</w:t>
-      </w:r>
-    </w:p>
-    <w:p>
-      <w:pPr>
-        <w:pStyle w:val="ListBullet"/>
-      </w:pPr>
-      <w:r>
-        <w:t>Display account details.</w:t>
-      </w:r>
-    </w:p>
-    <w:p>
-      <w:pPr>
-        <w:pStyle w:val="ListBullet"/>
-      </w:pPr>
-      <w:r>
-        <w:t>Calculate interest for a Savings Account.</w:t>
-      </w:r>
-    </w:p>
-    <w:p>
-      <w:pPr>
-        <w:pStyle w:val="ListBullet"/>
-      </w:pPr>
-      <w:r>
-        <w:t>Apply for a loan.</w:t>
-      </w:r>
-    </w:p>
-    <w:p>
-      <w:pPr>
-        <w:pStyle w:val="ListBullet"/>
-      </w:pPr>
-      <w:r>
-        <w:t>Handle insufficient balance or overdraft-limit errors.</w:t>
-      </w:r>
-    </w:p>
-    <w:p>
-      <w:pPr>
-        <w:pStyle w:val="ListBullet"/>
-      </w:pPr>
-      <w:r>
-        <w:t>Exit the banking system.</w:t>
-      </w:r>
-    </w:p>
-    <w:p>
-      <w:pPr>
-        <w:pStyle w:val="Heading1"/>
-      </w:pPr>
-      <w:r>
-        <w:t>8. Program Flow</w:t>
-      </w:r>
-    </w:p>
-    <w:p>
-      <w:pPr>
-        <w:pStyle w:val="ListBullet"/>
-      </w:pPr>
-      <w:r>
-        <w:t>Start the application.</w:t>
-      </w:r>
-    </w:p>
-    <w:p>
-      <w:pPr>
-        <w:pStyle w:val="ListBullet"/>
-      </w:pPr>
-      <w:r>
-        <w:t>Enter account number, holder name, and initial balance.</w:t>
-      </w:r>
-    </w:p>
-    <w:p>
-      <w:pPr>
-        <w:pStyle w:val="ListBullet"/>
-      </w:pPr>
       <w:r>
         <w:t>Select Savings Account or Current Account.</w:t>
       </w:r>
     </w:p>
     <w:p>
       <w:pPr>
-        <w:pStyle w:val="ListBullet"/>
+        <w:spacing w:after="60"/>
       </w:pPr>
       <w:r>
-        <w:t>Create the account.</w:t>
+        <w:rPr>
+          <w:b/>
+          <w:color w:val="003366"/>
+        </w:rPr>
+        <w:t xml:space="preserve">6. </w:t>
+      </w:r>
+      <w:r>
+        <w:t>Account is created using the Bank class.</w:t>
       </w:r>
     </w:p>
     <w:p>
       <w:pPr>
-        <w:pStyle w:val="ListBullet"/>
+        <w:spacing w:after="60"/>
       </w:pPr>
       <w:r>
-        <w:t>Display the banking menu.</w:t>
+        <w:rPr>
+          <w:b/>
+          <w:color w:val="003366"/>
+        </w:rPr>
+        <w:t xml:space="preserve">7. </w:t>
+      </w:r>
+      <w:r>
+        <w:t>Account details are saved into SQLite.</w:t>
       </w:r>
     </w:p>
     <w:p>
       <w:pPr>
-        <w:pStyle w:val="ListBullet"/>
+        <w:spacing w:after="60"/>
       </w:pPr>
       <w:r>
-        <w:t>Select an operation.</w:t>
+        <w:rPr>
+          <w:b/>
+          <w:color w:val="003366"/>
+        </w:rPr>
+        <w:t xml:space="preserve">8. </w:t>
+      </w:r>
+      <w:r>
+        <w:t>Banking menu is displayed.</w:t>
       </w:r>
     </w:p>
     <w:p>
       <w:pPr>
-        <w:pStyle w:val="ListBullet"/>
+        <w:spacing w:after="60"/>
       </w:pPr>
       <w:r>
-        <w:t>Perform the selected operation.</w:t>
+        <w:rPr>
+          <w:b/>
+          <w:color w:val="003366"/>
+        </w:rPr>
+        <w:t xml:space="preserve">9. </w:t>
+      </w:r>
+      <w:r>
+        <w:t>User selects an operation.</w:t>
       </w:r>
     </w:p>
     <w:p>
       <w:pPr>
-        <w:pStyle w:val="ListBullet"/>
+        <w:spacing w:after="60"/>
       </w:pPr>
       <w:r>
-        <w:t>Handle any BankingException using try-catch.</w:t>
+        <w:rPr>
+          <w:b/>
+          <w:color w:val="003366"/>
+        </w:rPr>
+        <w:t xml:space="preserve">10. </w:t>
+      </w:r>
+      <w:r>
+        <w:t>Deposit or withdrawal updates the account balance.</w:t>
       </w:r>
     </w:p>
     <w:p>
       <w:pPr>
-        <w:pStyle w:val="ListBullet"/>
+        <w:spacing w:after="60"/>
       </w:pPr>
       <w:r>
-        <w:t>Return to the menu until Exit is selected.</w:t>
+        <w:rPr>
+          <w:b/>
+          <w:color w:val="003366"/>
+        </w:rPr>
+        <w:t xml:space="preserve">11. </w:t>
+      </w:r>
+      <w:r>
+        <w:t>Updated balance is also stored in SQLite.</w:t>
       </w:r>
     </w:p>
     <w:p>
       <w:pPr>
-        <w:pStyle w:val="Heading1"/>
+        <w:spacing w:after="60"/>
       </w:pPr>
       <w:r>
-        <w:t>9. Sample Execution</w:t>
+        <w:rPr>
+          <w:b/>
+          <w:color w:val="003366"/>
+        </w:rPr>
+        <w:t xml:space="preserve">12. </w:t>
+      </w:r>
+      <w:r>
+        <w:t>User can display account details, calculate interest, or apply for a loan.</w:t>
       </w:r>
     </w:p>
     <w:p>
+      <w:pPr>
+        <w:spacing w:after="60"/>
+      </w:pPr>
       <w:r>
+        <w:rPr>
+          <w:b/>
+          <w:color w:val="003366"/>
+        </w:rPr>
+        <w:t xml:space="preserve">13. </w:t>
+      </w:r>
+      <w:r>
+        <w:t>User selects Exit to close the application.</w:t>
+      </w:r>
+    </w:p>
+    <w:p>
+      <w:pPr>
+        <w:spacing w:after="120"/>
+      </w:pPr>
+    </w:p>
+    <w:p>
+      <w:pPr>
+        <w:pStyle w:val="Heading1"/>
+        <w:keepNext/>
+        <w:spacing w:before="240" w:after="120"/>
+      </w:pPr>
+      <w:r>
+        <w:rPr>
+          <w:rFonts w:ascii="Calibri" w:hAnsi="Calibri"/>
+          <w:b/>
+          <w:color w:val="003366"/>
+          <w:sz w:val="32"/>
+        </w:rPr>
+        <w:t>11. Sample Execution</w:t>
+      </w:r>
+    </w:p>
+    <w:p>
+      <w:pPr>
+        <w:spacing w:after="240"/>
+        <w:ind w:left="288"/>
+      </w:pPr>
+      <w:r>
+        <w:rPr>
+          <w:rFonts w:ascii="Consolas" w:hAnsi="Consolas"/>
+          <w:sz w:val="19"/>
+        </w:rPr>
         <w:t>===== BANKING SYSTEM =====</w:t>
         <w:br/>
         <w:t>Enter Account Number: 1001</w:t>
         <w:br/>
-        <w:t>Enter Account Holder Name: Sathvika</w:t>
+        <w:t>Enter Account Holder Name: sathvika</w:t>
         <w:br/>
         <w:t>Enter Initial Balance: 1000</w:t>
         <w:br/>
@@ -860,6 +2411,8 @@
         <w:t>Account created successfully.</w:t>
         <w:br/>
         <w:t>Total Accounts: 1</w:t>
+        <w:br/>
+        <w:t>Account saved to database.</w:t>
         <w:br/>
         <w:br/>
         <w:t>1. Deposit</w:t>
@@ -878,210 +2431,564 @@
     <w:p>
       <w:pPr>
         <w:pStyle w:val="Heading1"/>
+        <w:keepNext/>
+        <w:spacing w:before="240" w:after="120"/>
       </w:pPr>
       <w:r>
-        <w:t>10. Exception Handling</w:t>
+        <w:rPr>
+          <w:rFonts w:ascii="Calibri" w:hAnsi="Calibri"/>
+          <w:b/>
+          <w:color w:val="003366"/>
+          <w:sz w:val="32"/>
+        </w:rPr>
+        <w:t>12. Database Testing Results</w:t>
       </w:r>
     </w:p>
     <w:p>
+      <w:pPr>
+        <w:pStyle w:val="Heading2"/>
+        <w:keepNext/>
+        <w:spacing w:before="160" w:after="60"/>
+      </w:pPr>
       <w:r>
-        <w:t>BankingException is a custom checked exception. It is used when a withdrawal cannot be completed. For a Savings Account, an amount greater than the available balance produces an 'Insufficient balance' message. For a Current Account, a withdrawal above the balance plus the 5000 overdraft limit produces an 'Overdraft limit exceeded' message.</w:t>
+        <w:rPr>
+          <w:rFonts w:ascii="Calibri" w:hAnsi="Calibri"/>
+          <w:b/>
+          <w:color w:val="4682B4"/>
+          <w:sz w:val="26"/>
+        </w:rPr>
+        <w:t>Database Connection</w:t>
       </w:r>
     </w:p>
     <w:p>
       <w:pPr>
-        <w:pStyle w:val="Heading1"/>
+        <w:spacing w:after="120"/>
       </w:pPr>
       <w:r>
-        <w:t>11. Technologies Used</w:t>
+        <w:t>Successfully tested: Database connected successfully.</w:t>
       </w:r>
     </w:p>
     <w:p>
       <w:pPr>
-        <w:pStyle w:val="ListBullet"/>
+        <w:pStyle w:val="Heading2"/>
+        <w:keepNext/>
+        <w:spacing w:before="160" w:after="60"/>
       </w:pPr>
       <w:r>
-        <w:t>Programming Language: Java</w:t>
+        <w:rPr>
+          <w:rFonts w:ascii="Calibri" w:hAnsi="Calibri"/>
+          <w:b/>
+          <w:color w:val="4682B4"/>
+          <w:sz w:val="26"/>
+        </w:rPr>
+        <w:t>Table Creation</w:t>
       </w:r>
     </w:p>
     <w:p>
       <w:pPr>
-        <w:pStyle w:val="ListBullet"/>
+        <w:spacing w:after="120"/>
       </w:pPr>
       <w:r>
-        <w:t>Development Environment: Eclipse IDE</w:t>
+        <w:t>Successfully tested: Accounts table created successfully.</w:t>
       </w:r>
     </w:p>
     <w:p>
       <w:pPr>
-        <w:pStyle w:val="ListBullet"/>
+        <w:pStyle w:val="Heading2"/>
+        <w:keepNext/>
+        <w:spacing w:before="160" w:after="60"/>
       </w:pPr>
       <w:r>
-        <w:t>Application Type: Console-Based Application</w:t>
+        <w:rPr>
+          <w:rFonts w:ascii="Calibri" w:hAnsi="Calibri"/>
+          <w:b/>
+          <w:color w:val="4682B4"/>
+          <w:sz w:val="26"/>
+        </w:rPr>
+        <w:t>Account Storage</w:t>
       </w:r>
     </w:p>
     <w:p>
       <w:pPr>
-        <w:pStyle w:val="ListBullet"/>
+        <w:spacing w:after="120"/>
       </w:pPr>
       <w:r>
-        <w:t>Version Control: Git and GitHub</w:t>
+        <w:t>Successfully stored:</w:t>
+        <w:br/>
+        <w:t>Account Number: 1001 | Holder Name: sathvika | Balance: 1000.0 | Account Type: Savings</w:t>
       </w:r>
     </w:p>
     <w:p>
       <w:pPr>
-        <w:pStyle w:val="Heading1"/>
+        <w:pStyle w:val="Heading2"/>
+        <w:keepNext/>
+        <w:spacing w:before="160" w:after="60"/>
       </w:pPr>
       <w:r>
-        <w:t>12. How to Run the Project in Eclipse</w:t>
+        <w:rPr>
+          <w:rFonts w:ascii="Calibri" w:hAnsi="Calibri"/>
+          <w:b/>
+          <w:color w:val="4682B4"/>
+          <w:sz w:val="26"/>
+        </w:rPr>
+        <w:t>Deposit Testing</w:t>
       </w:r>
     </w:p>
     <w:p>
       <w:pPr>
-        <w:pStyle w:val="ListBullet"/>
-      </w:pPr>
+        <w:spacing w:after="120"/>
+      </w:pPr>
+      <w:r>
+        <w:t>Account 1002 was created with Initial Balance: 1000.0. After depositing 500, Balance became 1500.0. The updated balance was successfully stored in SQLite.</w:t>
+      </w:r>
+    </w:p>
+    <w:p>
+      <w:pPr>
+        <w:pStyle w:val="Heading2"/>
+        <w:keepNext/>
+        <w:spacing w:before="160" w:after="60"/>
+      </w:pPr>
+      <w:r>
+        <w:rPr>
+          <w:rFonts w:ascii="Calibri" w:hAnsi="Calibri"/>
+          <w:b/>
+          <w:color w:val="4682B4"/>
+          <w:sz w:val="26"/>
+        </w:rPr>
+        <w:t>Withdrawal Testing</w:t>
+      </w:r>
+    </w:p>
+    <w:p>
+      <w:pPr>
+        <w:spacing w:after="120"/>
+      </w:pPr>
+      <w:r>
+        <w:t>Account 1003 was created with Initial Balance: 2000.0. After withdrawing 500, Balance became 1500.0. The updated balance was successfully stored in SQLite.</w:t>
+      </w:r>
+    </w:p>
+    <w:p>
+      <w:pPr>
+        <w:pStyle w:val="Heading2"/>
+        <w:keepNext/>
+        <w:spacing w:before="160" w:after="60"/>
+      </w:pPr>
+      <w:r>
+        <w:rPr>
+          <w:rFonts w:ascii="Calibri" w:hAnsi="Calibri"/>
+          <w:b/>
+          <w:color w:val="4682B4"/>
+          <w:sz w:val="26"/>
+        </w:rPr>
+        <w:t>Savings Account Loan</w:t>
+      </w:r>
+    </w:p>
+    <w:p>
+      <w:pPr>
+        <w:spacing w:after="120"/>
+      </w:pPr>
+      <w:r>
+        <w:t>Successfully tested: Savings Account loan applied: 2000.0</w:t>
+      </w:r>
+    </w:p>
+    <w:p>
+      <w:pPr>
+        <w:pStyle w:val="Heading2"/>
+        <w:keepNext/>
+        <w:spacing w:before="160" w:after="60"/>
+      </w:pPr>
+      <w:r>
+        <w:rPr>
+          <w:rFonts w:ascii="Calibri" w:hAnsi="Calibri"/>
+          <w:b/>
+          <w:color w:val="4682B4"/>
+          <w:sz w:val="26"/>
+        </w:rPr>
+        <w:t>Current Account Testing</w:t>
+      </w:r>
+    </w:p>
+    <w:p>
+      <w:pPr>
+        <w:spacing w:after="120"/>
+      </w:pPr>
+      <w:r>
+        <w:t>Account 1005 was successfully created (Holder: currenttest, Balance: 5000.0).</w:t>
+        <w:br/>
+        <w:t>Interest calculation verified: Current Account: No savings interest.</w:t>
+        <w:br/>
+        <w:t>Business loan verified: Current Account business loan applied: 2000.0</w:t>
+      </w:r>
+    </w:p>
+    <w:p>
+      <w:pPr>
+        <w:pStyle w:val="Heading1"/>
+        <w:keepNext/>
+        <w:spacing w:before="240" w:after="120"/>
+      </w:pPr>
+      <w:r>
+        <w:rPr>
+          <w:rFonts w:ascii="Calibri" w:hAnsi="Calibri"/>
+          <w:b/>
+          <w:color w:val="003366"/>
+          <w:sz w:val="32"/>
+        </w:rPr>
+        <w:t>13. Exception Handling</w:t>
+      </w:r>
+    </w:p>
+    <w:p>
+      <w:pPr>
+        <w:spacing w:after="120"/>
+      </w:pPr>
+      <w:r>
+        <w:t>The project uses a custom BankingException class for banking-related errors. The MainApp class uses try-catch blocks to handle these exceptions effectively.</w:t>
+      </w:r>
+    </w:p>
+    <w:p>
+      <w:pPr>
+        <w:spacing w:after="240"/>
+      </w:pPr>
+      <w:r>
+        <w:t>For example, invalid withdrawal operations (e.g., withdrawing more than the available balance) display a clear, user-friendly error message instead of terminating the application unexpectedly.</w:t>
+      </w:r>
+    </w:p>
+    <w:p>
+      <w:pPr>
+        <w:pStyle w:val="Heading1"/>
+        <w:keepNext/>
+        <w:spacing w:before="240" w:after="120"/>
+      </w:pPr>
+      <w:r>
+        <w:rPr>
+          <w:rFonts w:ascii="Calibri" w:hAnsi="Calibri"/>
+          <w:b/>
+          <w:color w:val="003366"/>
+          <w:sz w:val="32"/>
+        </w:rPr>
+        <w:t>14. Technologies Used</w:t>
+      </w:r>
+    </w:p>
+    <w:p>
+      <w:pPr>
+        <w:spacing w:after="60"/>
+        <w:ind w:left="288"/>
+      </w:pPr>
+      <w:r>
+        <w:rPr>
+          <w:b/>
+        </w:rPr>
+        <w:t xml:space="preserve">• Programming Language: </w:t>
+      </w:r>
+      <w:r>
+        <w:t>Java</w:t>
+      </w:r>
+    </w:p>
+    <w:p>
+      <w:pPr>
+        <w:spacing w:after="60"/>
+        <w:ind w:left="288"/>
+      </w:pPr>
+      <w:r>
+        <w:rPr>
+          <w:b/>
+        </w:rPr>
+        <w:t xml:space="preserve">• IDE: </w:t>
+      </w:r>
+      <w:r>
+        <w:t>Eclipse</w:t>
+      </w:r>
+    </w:p>
+    <w:p>
+      <w:pPr>
+        <w:spacing w:after="60"/>
+        <w:ind w:left="288"/>
+      </w:pPr>
+      <w:r>
+        <w:rPr>
+          <w:b/>
+        </w:rPr>
+        <w:t xml:space="preserve">• Application Type: </w:t>
+      </w:r>
+      <w:r>
+        <w:t>Console-Based Application</w:t>
+      </w:r>
+    </w:p>
+    <w:p>
+      <w:pPr>
+        <w:spacing w:after="60"/>
+        <w:ind w:left="288"/>
+      </w:pPr>
+      <w:r>
+        <w:rPr>
+          <w:b/>
+        </w:rPr>
+        <w:t xml:space="preserve">• Database: </w:t>
+      </w:r>
+      <w:r>
+        <w:t>SQLite</w:t>
+      </w:r>
+    </w:p>
+    <w:p>
+      <w:pPr>
+        <w:spacing w:after="60"/>
+        <w:ind w:left="288"/>
+      </w:pPr>
+      <w:r>
+        <w:rPr>
+          <w:b/>
+        </w:rPr>
+        <w:t xml:space="preserve">• Database Connectivity: </w:t>
+      </w:r>
+      <w:r>
+        <w:t>JDBC</w:t>
+      </w:r>
+    </w:p>
+    <w:p>
+      <w:pPr>
+        <w:spacing w:after="60"/>
+        <w:ind w:left="288"/>
+      </w:pPr>
+      <w:r>
+        <w:rPr>
+          <w:b/>
+        </w:rPr>
+        <w:t xml:space="preserve">• SQLite Driver: </w:t>
+      </w:r>
+      <w:r>
+        <w:t>sqlite-jdbc-3.53.2.1.jar</w:t>
+      </w:r>
+    </w:p>
+    <w:p>
+      <w:pPr>
+        <w:spacing w:after="120"/>
+      </w:pPr>
+    </w:p>
+    <w:p>
+      <w:pPr>
+        <w:pStyle w:val="Heading1"/>
+        <w:keepNext/>
+        <w:spacing w:before="240" w:after="120"/>
+      </w:pPr>
+      <w:r>
+        <w:rPr>
+          <w:rFonts w:ascii="Calibri" w:hAnsi="Calibri"/>
+          <w:b/>
+          <w:color w:val="003366"/>
+          <w:sz w:val="32"/>
+        </w:rPr>
+        <w:t>15. How to Run the Project in Eclipse</w:t>
+      </w:r>
+    </w:p>
+    <w:p>
+      <w:pPr>
+        <w:spacing w:after="80"/>
+        <w:ind w:left="288"/>
+      </w:pPr>
+      <w:r>
+        <w:rPr>
+          <w:b/>
+          <w:color w:val="003366"/>
+        </w:rPr>
+        <w:t xml:space="preserve">Step 1: </w:t>
+      </w:r>
       <w:r>
         <w:t>Open Eclipse IDE.</w:t>
       </w:r>
     </w:p>
     <w:p>
       <w:pPr>
-        <w:pStyle w:val="ListBullet"/>
+        <w:spacing w:after="80"/>
+        <w:ind w:left="288"/>
       </w:pPr>
       <w:r>
-        <w:t>Import or create the BankingSystem Java project.</w:t>
+        <w:rPr>
+          <w:b/>
+          <w:color w:val="003366"/>
+        </w:rPr>
+        <w:t xml:space="preserve">Step 2: </w:t>
+      </w:r>
+      <w:r>
+        <w:t>Open the BankingSystem_Eclipse_Project project.</w:t>
       </w:r>
     </w:p>
     <w:p>
       <w:pPr>
-        <w:pStyle w:val="ListBullet"/>
-      </w:pPr>
+        <w:spacing w:after="80"/>
+        <w:ind w:left="288"/>
+      </w:pPr>
+      <w:r>
+        <w:rPr>
+          <w:b/>
+          <w:color w:val="003366"/>
+        </w:rPr>
+        <w:t xml:space="preserve">Step 3: </w:t>
+      </w:r>
       <w:r>
         <w:t>Make sure all Java files are inside the src folder.</w:t>
       </w:r>
     </w:p>
     <w:p>
       <w:pPr>
-        <w:pStyle w:val="ListBullet"/>
+        <w:spacing w:after="80"/>
+        <w:ind w:left="288"/>
       </w:pPr>
       <w:r>
-        <w:t>Save all files using Ctrl + S.</w:t>
+        <w:rPr>
+          <w:b/>
+          <w:color w:val="003366"/>
+        </w:rPr>
+        <w:t xml:space="preserve">Step 4: </w:t>
+      </w:r>
+      <w:r>
+        <w:t>Make sure the SQLite JAR is inside lib/sqlite-jdbc-3.53.2.1.jar.</w:t>
       </w:r>
     </w:p>
     <w:p>
       <w:pPr>
-        <w:pStyle w:val="ListBullet"/>
+        <w:spacing w:after="80"/>
+        <w:ind w:left="288"/>
       </w:pPr>
       <w:r>
-        <w:t>Right-click MainApp.java.</w:t>
+        <w:rPr>
+          <w:b/>
+          <w:color w:val="003366"/>
+        </w:rPr>
+        <w:t xml:space="preserve">Step 5: </w:t>
+      </w:r>
+      <w:r>
+        <w:t>Make sure the SQLite JAR is added to the project's Build Path (Build Path -&gt; Add to Build Path).</w:t>
       </w:r>
     </w:p>
     <w:p>
       <w:pPr>
-        <w:pStyle w:val="ListBullet"/>
+        <w:spacing w:after="80"/>
+        <w:ind w:left="288"/>
       </w:pPr>
       <w:r>
-        <w:t>Select Run As → Java Application.</w:t>
+        <w:rPr>
+          <w:b/>
+          <w:color w:val="003366"/>
+        </w:rPr>
+        <w:t xml:space="preserve">Step 6: </w:t>
+      </w:r>
+      <w:r>
+        <w:t>Run DatabaseTest.java using Run As -&gt; Java Application.</w:t>
+        <w:br/>
+        <w:t>Expected output: Database connected successfully.</w:t>
       </w:r>
     </w:p>
     <w:p>
       <w:pPr>
-        <w:pStyle w:val="ListBullet"/>
+        <w:spacing w:after="80"/>
+        <w:ind w:left="288"/>
       </w:pPr>
       <w:r>
-        <w:t>Enter the requested account information in the Console.</w:t>
+        <w:rPr>
+          <w:b/>
+          <w:color w:val="003366"/>
+        </w:rPr>
+        <w:t xml:space="preserve">Step 7: </w:t>
+      </w:r>
+      <w:r>
+        <w:t>Run DatabaseSetup.java.</w:t>
+        <w:br/>
+        <w:t>Expected output: Accounts table created successfully.</w:t>
       </w:r>
     </w:p>
     <w:p>
       <w:pPr>
-        <w:pStyle w:val="ListBullet"/>
+        <w:spacing w:after="80"/>
+        <w:ind w:left="288"/>
       </w:pPr>
       <w:r>
-        <w:t>Use the menu to test banking operations.</w:t>
+        <w:rPr>
+          <w:b/>
+          <w:color w:val="003366"/>
+        </w:rPr>
+        <w:t xml:space="preserve">Step 8: </w:t>
+      </w:r>
+      <w:r>
+        <w:t>Run MainApp.java using Run As -&gt; Java Application.</w:t>
       </w:r>
     </w:p>
     <w:p>
       <w:pPr>
-        <w:pStyle w:val="Heading1"/>
+        <w:spacing w:after="80"/>
+        <w:ind w:left="288"/>
       </w:pPr>
       <w:r>
-        <w:t>13. Git and GitHub</w:t>
+        <w:rPr>
+          <w:b/>
+          <w:color w:val="003366"/>
+        </w:rPr>
+        <w:t xml:space="preserve">Step 9: </w:t>
+      </w:r>
+      <w:r>
+        <w:t>Enter the account details and perform operations using the console menu.</w:t>
       </w:r>
     </w:p>
     <w:p>
+      <w:pPr>
+        <w:spacing w:after="80"/>
+        <w:ind w:left="288"/>
+      </w:pPr>
       <w:r>
-        <w:t>After successfully testing the project in Eclipse, the project can be stored in Git and pushed to GitHub for version control and sharing.</w:t>
+        <w:rPr>
+          <w:b/>
+          <w:color w:val="003366"/>
+        </w:rPr>
+        <w:t xml:space="preserve">Step 10: </w:t>
+      </w:r>
+      <w:r>
+        <w:t>Run AccountViewer.java to verify the accounts stored in the SQLite database.</w:t>
       </w:r>
     </w:p>
     <w:p>
+      <w:pPr>
+        <w:spacing w:after="120"/>
+      </w:pPr>
+    </w:p>
+    <w:p>
+      <w:pPr>
+        <w:pStyle w:val="Heading1"/>
+        <w:keepNext/>
+        <w:spacing w:before="240" w:after="120"/>
+      </w:pPr>
       <w:r>
-        <w:t>Basic commands:</w:t>
+        <w:rPr>
+          <w:rFonts w:ascii="Calibri" w:hAnsi="Calibri"/>
+          <w:b/>
+          <w:color w:val="003366"/>
+          <w:sz w:val="32"/>
+        </w:rPr>
+        <w:t>16. Conclusion</w:t>
       </w:r>
     </w:p>
     <w:p>
+      <w:pPr>
+        <w:spacing w:after="120"/>
+      </w:pPr>
       <w:r>
-        <w:rPr>
-          <w:rFonts w:ascii="Courier New" w:hAnsi="Courier New"/>
-        </w:rPr>
-        <w:t>git init</w:t>
+        <w:t>The Console-Based Banking System demonstrates important Java Object-Oriented Programming concepts together with SQLite database connectivity.</w:t>
       </w:r>
     </w:p>
     <w:p>
+      <w:pPr>
+        <w:spacing w:after="120"/>
+      </w:pPr>
       <w:r>
-        <w:rPr>
-          <w:rFonts w:ascii="Courier New" w:hAnsi="Courier New"/>
-        </w:rPr>
-        <w:t>git add .</w:t>
+        <w:t>The project successfully implements Savings Account, Current Account, Interfaces, Inheritance, Abstraction, Polymorphism, Custom Exception Handling, Deposit, Withdrawal, Interest Calculation, Loan Processing, SQLite database storage, balance updates, and record retrieval.</w:t>
       </w:r>
     </w:p>
     <w:p>
+      <w:pPr>
+        <w:spacing w:after="240"/>
+      </w:pPr>
       <w:r>
-        <w:rPr>
-          <w:rFonts w:ascii="Courier New" w:hAnsi="Courier New"/>
-        </w:rPr>
-        <w:t>git commit -m "Initial Banking System project"</w:t>
-      </w:r>
-    </w:p>
-    <w:p>
-      <w:r>
-        <w:rPr>
-          <w:rFonts w:ascii="Courier New" w:hAnsi="Courier New"/>
-        </w:rPr>
-        <w:t>git branch -M main</w:t>
-      </w:r>
-    </w:p>
-    <w:p>
-      <w:r>
-        <w:rPr>
-          <w:rFonts w:ascii="Courier New" w:hAnsi="Courier New"/>
-        </w:rPr>
-        <w:t>git remote add origin YOUR_GITHUB_REPOSITORY_URL</w:t>
-      </w:r>
-    </w:p>
-    <w:p>
-      <w:r>
-        <w:rPr>
-          <w:rFonts w:ascii="Courier New" w:hAnsi="Courier New"/>
-        </w:rPr>
-        <w:t>git push -u origin main</w:t>
-      </w:r>
-    </w:p>
-    <w:p>
-      <w:pPr>
-        <w:pStyle w:val="Heading1"/>
-      </w:pPr>
-      <w:r>
-        <w:t>14. Conclusion</w:t>
-      </w:r>
-    </w:p>
-    <w:p>
-      <w:r>
-        <w:t>The Console-Based Banking System demonstrates how Java OOP concepts can be combined to build a simple real-world application. The use of abstraction, inheritance, interfaces, polymorphism, encapsulation, exception handling, static members, final constants, and method overloading makes the project suitable for learning and demonstrating object-oriented design.</w:t>
+        <w:t>The application was successfully developed, integrated, and thoroughly tested in Eclipse IDE.</w:t>
       </w:r>
     </w:p>
     <w:sectPr>
       <w:pgSz w:w="12240" w:h="15840"/>
-      <w:pgMar w:top="1440" w:right="1800" w:bottom="1440" w:left="1800" w:header="720" w:footer="720" w:gutter="0"/>
+      <w:pgMar w:top="1440" w:right="1440" w:bottom="1440" w:left="1440" w:header="720" w:footer="720" w:gutter="0"/>
       <w:cols w:space="720"/>
       <w:docGrid w:linePitch="360"/>
     </w:sectPr>
@@ -1453,7 +3360,8 @@
     <w:qFormat/>
     <w:rsid w:val="00FC693F"/>
     <w:rPr>
-      <w:rFonts w:ascii="Arial" w:hAnsi="Arial"/>
+      <w:rFonts w:ascii="Calibri" w:hAnsi="Calibri"/>
+      <w:color w:val="333333"/>
       <w:sz w:val="22"/>
     </w:rPr>
   </w:style>

</xml_diff>